<commit_message>
Actualizar el Word de notas con la seccion de excepciones
</commit_message>
<xml_diff>
--- a/docs/Notas del proyecto.docx
+++ b/docs/Notas del proyecto.docx
@@ -68,7 +68,7 @@
     <w:sdt>
       <w:sdtPr>
         <w:alias w:val="Contenido"/>
-        <w:id w:val="-1054536466"/>
+        <w:id w:val="-1295286309"/>
         <w:docPartObj>
           <w:docPartGallery w:val="Table of Contents"/>
           <w:docPartUnique/>
@@ -100,7 +100,7 @@
           <w:r>
             <w:fldChar w:fldCharType="separate"/>
           </w:r>
-          <w:hyperlink w:anchor="_Toc244249793" w:history="1">
+          <w:hyperlink w:anchor="_Toc244253425" w:history="1">
             <w:r>
               <w:rPr>
                 <w:rStyle w:val="Hipervnculo"/>
@@ -124,7 +124,7 @@
               <w:rPr>
                 <w:noProof/>
               </w:rPr>
-              <w:instrText xml:space="preserve"> PAGEREF _Toc244249793 \h </w:instrText>
+              <w:instrText xml:space="preserve"> PAGEREF _Toc244253425 \h </w:instrText>
             </w:r>
             <w:r>
               <w:rPr>
@@ -141,7 +141,7 @@
               <w:rPr>
                 <w:noProof/>
               </w:rPr>
-              <w:t>3</w:t>
+              <w:t>4</w:t>
             </w:r>
             <w:r>
               <w:rPr>
@@ -166,7 +166,7 @@
               <w14:ligatures w14:val="standardContextual"/>
             </w:rPr>
           </w:pPr>
-          <w:hyperlink w:anchor="_Toc244249794" w:history="1">
+          <w:hyperlink w:anchor="_Toc244253426" w:history="1">
             <w:r>
               <w:rPr>
                 <w:rStyle w:val="Hipervnculo"/>
@@ -190,7 +190,7 @@
               <w:rPr>
                 <w:noProof/>
               </w:rPr>
-              <w:instrText xml:space="preserve"> PAGEREF _Toc244249794 \h </w:instrText>
+              <w:instrText xml:space="preserve"> PAGEREF _Toc244253426 \h </w:instrText>
             </w:r>
             <w:r>
               <w:rPr>
@@ -207,7 +207,7 @@
               <w:rPr>
                 <w:noProof/>
               </w:rPr>
-              <w:t>3</w:t>
+              <w:t>4</w:t>
             </w:r>
             <w:r>
               <w:rPr>
@@ -232,7 +232,7 @@
               <w14:ligatures w14:val="standardContextual"/>
             </w:rPr>
           </w:pPr>
-          <w:hyperlink w:anchor="_Toc244249795" w:history="1">
+          <w:hyperlink w:anchor="_Toc244253427" w:history="1">
             <w:r>
               <w:rPr>
                 <w:rStyle w:val="Hipervnculo"/>
@@ -256,7 +256,7 @@
               <w:rPr>
                 <w:noProof/>
               </w:rPr>
-              <w:instrText xml:space="preserve"> PAGEREF _Toc244249795 \h </w:instrText>
+              <w:instrText xml:space="preserve"> PAGEREF _Toc244253427 \h </w:instrText>
             </w:r>
             <w:r>
               <w:rPr>
@@ -273,7 +273,7 @@
               <w:rPr>
                 <w:noProof/>
               </w:rPr>
-              <w:t>4</w:t>
+              <w:t>5</w:t>
             </w:r>
             <w:r>
               <w:rPr>
@@ -298,7 +298,7 @@
               <w14:ligatures w14:val="standardContextual"/>
             </w:rPr>
           </w:pPr>
-          <w:hyperlink w:anchor="_Toc244249796" w:history="1">
+          <w:hyperlink w:anchor="_Toc244253428" w:history="1">
             <w:r>
               <w:rPr>
                 <w:rStyle w:val="Hipervnculo"/>
@@ -322,7 +322,7 @@
               <w:rPr>
                 <w:noProof/>
               </w:rPr>
-              <w:instrText xml:space="preserve"> PAGEREF _Toc244249796 \h </w:instrText>
+              <w:instrText xml:space="preserve"> PAGEREF _Toc244253428 \h </w:instrText>
             </w:r>
             <w:r>
               <w:rPr>
@@ -339,7 +339,7 @@
               <w:rPr>
                 <w:noProof/>
               </w:rPr>
-              <w:t>5</w:t>
+              <w:t>6</w:t>
             </w:r>
             <w:r>
               <w:rPr>
@@ -364,7 +364,7 @@
               <w14:ligatures w14:val="standardContextual"/>
             </w:rPr>
           </w:pPr>
-          <w:hyperlink w:anchor="_Toc244249797" w:history="1">
+          <w:hyperlink w:anchor="_Toc244253429" w:history="1">
             <w:r>
               <w:rPr>
                 <w:rStyle w:val="Hipervnculo"/>
@@ -388,7 +388,7 @@
               <w:rPr>
                 <w:noProof/>
               </w:rPr>
-              <w:instrText xml:space="preserve"> PAGEREF _Toc244249797 \h </w:instrText>
+              <w:instrText xml:space="preserve"> PAGEREF _Toc244253429 \h </w:instrText>
             </w:r>
             <w:r>
               <w:rPr>
@@ -405,7 +405,7 @@
               <w:rPr>
                 <w:noProof/>
               </w:rPr>
-              <w:t>5</w:t>
+              <w:t>6</w:t>
             </w:r>
             <w:r>
               <w:rPr>
@@ -430,7 +430,7 @@
               <w14:ligatures w14:val="standardContextual"/>
             </w:rPr>
           </w:pPr>
-          <w:hyperlink w:anchor="_Toc244249798" w:history="1">
+          <w:hyperlink w:anchor="_Toc244253430" w:history="1">
             <w:r>
               <w:rPr>
                 <w:rStyle w:val="Hipervnculo"/>
@@ -454,7 +454,7 @@
               <w:rPr>
                 <w:noProof/>
               </w:rPr>
-              <w:instrText xml:space="preserve"> PAGEREF _Toc244249798 \h </w:instrText>
+              <w:instrText xml:space="preserve"> PAGEREF _Toc244253430 \h </w:instrText>
             </w:r>
             <w:r>
               <w:rPr>
@@ -471,7 +471,7 @@
               <w:rPr>
                 <w:noProof/>
               </w:rPr>
-              <w:t>6</w:t>
+              <w:t>7</w:t>
             </w:r>
             <w:r>
               <w:rPr>
@@ -496,7 +496,7 @@
               <w14:ligatures w14:val="standardContextual"/>
             </w:rPr>
           </w:pPr>
-          <w:hyperlink w:anchor="_Toc244249799" w:history="1">
+          <w:hyperlink w:anchor="_Toc244253431" w:history="1">
             <w:r>
               <w:rPr>
                 <w:rStyle w:val="Hipervnculo"/>
@@ -520,7 +520,7 @@
               <w:rPr>
                 <w:noProof/>
               </w:rPr>
-              <w:instrText xml:space="preserve"> PAGEREF _Toc244249799 \h </w:instrText>
+              <w:instrText xml:space="preserve"> PAGEREF _Toc244253431 \h </w:instrText>
             </w:r>
             <w:r>
               <w:rPr>
@@ -537,7 +537,7 @@
               <w:rPr>
                 <w:noProof/>
               </w:rPr>
-              <w:t>6</w:t>
+              <w:t>7</w:t>
             </w:r>
             <w:r>
               <w:rPr>
@@ -562,7 +562,7 @@
               <w14:ligatures w14:val="standardContextual"/>
             </w:rPr>
           </w:pPr>
-          <w:hyperlink w:anchor="_Toc244249800" w:history="1">
+          <w:hyperlink w:anchor="_Toc244253432" w:history="1">
             <w:r>
               <w:rPr>
                 <w:rStyle w:val="Hipervnculo"/>
@@ -586,7 +586,7 @@
               <w:rPr>
                 <w:noProof/>
               </w:rPr>
-              <w:instrText xml:space="preserve"> PAGEREF _Toc244249800 \h </w:instrText>
+              <w:instrText xml:space="preserve"> PAGEREF _Toc244253432 \h </w:instrText>
             </w:r>
             <w:r>
               <w:rPr>
@@ -603,7 +603,7 @@
               <w:rPr>
                 <w:noProof/>
               </w:rPr>
-              <w:t>6</w:t>
+              <w:t>7</w:t>
             </w:r>
             <w:r>
               <w:rPr>
@@ -628,7 +628,7 @@
               <w14:ligatures w14:val="standardContextual"/>
             </w:rPr>
           </w:pPr>
-          <w:hyperlink w:anchor="_Toc244249801" w:history="1">
+          <w:hyperlink w:anchor="_Toc244253433" w:history="1">
             <w:r>
               <w:rPr>
                 <w:rStyle w:val="Hipervnculo"/>
@@ -652,7 +652,7 @@
               <w:rPr>
                 <w:noProof/>
               </w:rPr>
-              <w:instrText xml:space="preserve"> PAGEREF _Toc244249801 \h </w:instrText>
+              <w:instrText xml:space="preserve"> PAGEREF _Toc244253433 \h </w:instrText>
             </w:r>
             <w:r>
               <w:rPr>
@@ -669,7 +669,7 @@
               <w:rPr>
                 <w:noProof/>
               </w:rPr>
-              <w:t>7</w:t>
+              <w:t>8</w:t>
             </w:r>
             <w:r>
               <w:rPr>
@@ -694,7 +694,7 @@
               <w14:ligatures w14:val="standardContextual"/>
             </w:rPr>
           </w:pPr>
-          <w:hyperlink w:anchor="_Toc244249802" w:history="1">
+          <w:hyperlink w:anchor="_Toc244253434" w:history="1">
             <w:r>
               <w:rPr>
                 <w:rStyle w:val="Hipervnculo"/>
@@ -718,7 +718,7 @@
               <w:rPr>
                 <w:noProof/>
               </w:rPr>
-              <w:instrText xml:space="preserve"> PAGEREF _Toc244249802 \h </w:instrText>
+              <w:instrText xml:space="preserve"> PAGEREF _Toc244253434 \h </w:instrText>
             </w:r>
             <w:r>
               <w:rPr>
@@ -735,7 +735,7 @@
               <w:rPr>
                 <w:noProof/>
               </w:rPr>
-              <w:t>8</w:t>
+              <w:t>9</w:t>
             </w:r>
             <w:r>
               <w:rPr>
@@ -760,7 +760,7 @@
               <w14:ligatures w14:val="standardContextual"/>
             </w:rPr>
           </w:pPr>
-          <w:hyperlink w:anchor="_Toc244249803" w:history="1">
+          <w:hyperlink w:anchor="_Toc244253435" w:history="1">
             <w:r>
               <w:rPr>
                 <w:rStyle w:val="Hipervnculo"/>
@@ -784,7 +784,7 @@
               <w:rPr>
                 <w:noProof/>
               </w:rPr>
-              <w:instrText xml:space="preserve"> PAGEREF _Toc244249803 \h </w:instrText>
+              <w:instrText xml:space="preserve"> PAGEREF _Toc244253435 \h </w:instrText>
             </w:r>
             <w:r>
               <w:rPr>
@@ -801,7 +801,7 @@
               <w:rPr>
                 <w:noProof/>
               </w:rPr>
-              <w:t>9</w:t>
+              <w:t>10</w:t>
             </w:r>
             <w:r>
               <w:rPr>
@@ -826,7 +826,7 @@
               <w14:ligatures w14:val="standardContextual"/>
             </w:rPr>
           </w:pPr>
-          <w:hyperlink w:anchor="_Toc244249804" w:history="1">
+          <w:hyperlink w:anchor="_Toc244253436" w:history="1">
             <w:r>
               <w:rPr>
                 <w:rStyle w:val="Hipervnculo"/>
@@ -866,7 +866,7 @@
               <w:rPr>
                 <w:noProof/>
               </w:rPr>
-              <w:instrText xml:space="preserve"> PAGEREF _Toc244249804 \h </w:instrText>
+              <w:instrText xml:space="preserve"> PAGEREF _Toc244253436 \h </w:instrText>
             </w:r>
             <w:r>
               <w:rPr>
@@ -883,7 +883,7 @@
               <w:rPr>
                 <w:noProof/>
               </w:rPr>
-              <w:t>9</w:t>
+              <w:t>10</w:t>
             </w:r>
             <w:r>
               <w:rPr>
@@ -908,7 +908,7 @@
               <w14:ligatures w14:val="standardContextual"/>
             </w:rPr>
           </w:pPr>
-          <w:hyperlink w:anchor="_Toc244249805" w:history="1">
+          <w:hyperlink w:anchor="_Toc244253437" w:history="1">
             <w:r>
               <w:rPr>
                 <w:rStyle w:val="Hipervnculo"/>
@@ -932,7 +932,7 @@
               <w:rPr>
                 <w:noProof/>
               </w:rPr>
-              <w:instrText xml:space="preserve"> PAGEREF _Toc244249805 \h </w:instrText>
+              <w:instrText xml:space="preserve"> PAGEREF _Toc244253437 \h </w:instrText>
             </w:r>
             <w:r>
               <w:rPr>
@@ -949,7 +949,7 @@
               <w:rPr>
                 <w:noProof/>
               </w:rPr>
-              <w:t>10</w:t>
+              <w:t>11</w:t>
             </w:r>
             <w:r>
               <w:rPr>
@@ -974,7 +974,7 @@
               <w14:ligatures w14:val="standardContextual"/>
             </w:rPr>
           </w:pPr>
-          <w:hyperlink w:anchor="_Toc244249806" w:history="1">
+          <w:hyperlink w:anchor="_Toc244253438" w:history="1">
             <w:r>
               <w:rPr>
                 <w:rStyle w:val="Hipervnculo"/>
@@ -998,7 +998,7 @@
               <w:rPr>
                 <w:noProof/>
               </w:rPr>
-              <w:instrText xml:space="preserve"> PAGEREF _Toc244249806 \h </w:instrText>
+              <w:instrText xml:space="preserve"> PAGEREF _Toc244253438 \h </w:instrText>
             </w:r>
             <w:r>
               <w:rPr>
@@ -1015,7 +1015,7 @@
               <w:rPr>
                 <w:noProof/>
               </w:rPr>
-              <w:t>12</w:t>
+              <w:t>13</w:t>
             </w:r>
             <w:r>
               <w:rPr>
@@ -1040,7 +1040,7 @@
               <w14:ligatures w14:val="standardContextual"/>
             </w:rPr>
           </w:pPr>
-          <w:hyperlink w:anchor="_Toc244249807" w:history="1">
+          <w:hyperlink w:anchor="_Toc244253439" w:history="1">
             <w:r>
               <w:rPr>
                 <w:rStyle w:val="Hipervnculo"/>
@@ -1064,7 +1064,7 @@
               <w:rPr>
                 <w:noProof/>
               </w:rPr>
-              <w:instrText xml:space="preserve"> PAGEREF _Toc244249807 \h </w:instrText>
+              <w:instrText xml:space="preserve"> PAGEREF _Toc244253439 \h </w:instrText>
             </w:r>
             <w:r>
               <w:rPr>
@@ -1081,7 +1081,7 @@
               <w:rPr>
                 <w:noProof/>
               </w:rPr>
-              <w:t>14</w:t>
+              <w:t>15</w:t>
             </w:r>
             <w:r>
               <w:rPr>
@@ -1106,7 +1106,7 @@
               <w14:ligatures w14:val="standardContextual"/>
             </w:rPr>
           </w:pPr>
-          <w:hyperlink w:anchor="_Toc244249808" w:history="1">
+          <w:hyperlink w:anchor="_Toc244253440" w:history="1">
             <w:r>
               <w:rPr>
                 <w:rStyle w:val="Hipervnculo"/>
@@ -1130,7 +1130,7 @@
               <w:rPr>
                 <w:noProof/>
               </w:rPr>
-              <w:instrText xml:space="preserve"> PAGEREF _Toc244249808 \h </w:instrText>
+              <w:instrText xml:space="preserve"> PAGEREF _Toc244253440 \h </w:instrText>
             </w:r>
             <w:r>
               <w:rPr>
@@ -1147,7 +1147,7 @@
               <w:rPr>
                 <w:noProof/>
               </w:rPr>
-              <w:t>15</w:t>
+              <w:t>16</w:t>
             </w:r>
             <w:r>
               <w:rPr>
@@ -1172,7 +1172,7 @@
               <w14:ligatures w14:val="standardContextual"/>
             </w:rPr>
           </w:pPr>
-          <w:hyperlink w:anchor="_Toc244249809" w:history="1">
+          <w:hyperlink w:anchor="_Toc244253441" w:history="1">
             <w:r>
               <w:rPr>
                 <w:rStyle w:val="Hipervnculo"/>
@@ -1196,7 +1196,7 @@
               <w:rPr>
                 <w:noProof/>
               </w:rPr>
-              <w:instrText xml:space="preserve"> PAGEREF _Toc244249809 \h </w:instrText>
+              <w:instrText xml:space="preserve"> PAGEREF _Toc244253441 \h </w:instrText>
             </w:r>
             <w:r>
               <w:rPr>
@@ -1213,7 +1213,73 @@
               <w:rPr>
                 <w:noProof/>
               </w:rPr>
-              <w:t>17</w:t>
+              <w:t>18</w:t>
+            </w:r>
+            <w:r>
+              <w:rPr>
+                <w:noProof/>
+              </w:rPr>
+              <w:fldChar w:fldCharType="end"/>
+            </w:r>
+          </w:hyperlink>
+        </w:p>
+        <w:p>
+          <w:pPr>
+            <w:pStyle w:val="TDC2"/>
+            <w:tabs>
+              <w:tab w:val="right" w:leader="dot" w:pos="9628"/>
+            </w:tabs>
+            <w:rPr>
+              <w:rFonts w:asciiTheme="minorHAnsi" w:eastAsiaTheme="minorEastAsia" w:hAnsiTheme="minorHAnsi" w:cstheme="minorBidi"/>
+              <w:noProof/>
+              <w:kern w:val="2"/>
+              <w:sz w:val="24"/>
+              <w:szCs w:val="24"/>
+              <w14:ligatures w14:val="standardContextual"/>
+            </w:rPr>
+          </w:pPr>
+          <w:hyperlink w:anchor="_Toc244253442" w:history="1">
+            <w:r>
+              <w:rPr>
+                <w:rStyle w:val="Hipervnculo"/>
+                <w:noProof/>
+              </w:rPr>
+              <w:t>Excepciones — alineadas con RedSocial (30/10)</w:t>
+            </w:r>
+            <w:r>
+              <w:rPr>
+                <w:noProof/>
+              </w:rPr>
+              <w:tab/>
+            </w:r>
+            <w:r>
+              <w:rPr>
+                <w:noProof/>
+              </w:rPr>
+              <w:fldChar w:fldCharType="begin"/>
+            </w:r>
+            <w:r>
+              <w:rPr>
+                <w:noProof/>
+              </w:rPr>
+              <w:instrText xml:space="preserve"> PAGEREF _Toc244253442 \h </w:instrText>
+            </w:r>
+            <w:r>
+              <w:rPr>
+                <w:noProof/>
+              </w:rPr>
+            </w:r>
+            <w:r>
+              <w:rPr>
+                <w:noProof/>
+              </w:rPr>
+              <w:fldChar w:fldCharType="separate"/>
+            </w:r>
+            <w:r>
+              <w:rPr>
+                <w:noProof/>
+              </w:rPr>
+              <w:t>19</w:t>
             </w:r>
             <w:r>
               <w:rPr>
@@ -1238,7 +1304,7 @@
               <w14:ligatures w14:val="standardContextual"/>
             </w:rPr>
           </w:pPr>
-          <w:hyperlink w:anchor="_Toc244249810" w:history="1">
+          <w:hyperlink w:anchor="_Toc244253443" w:history="1">
             <w:r>
               <w:rPr>
                 <w:rStyle w:val="Hipervnculo"/>
@@ -1262,7 +1328,7 @@
               <w:rPr>
                 <w:noProof/>
               </w:rPr>
-              <w:instrText xml:space="preserve"> PAGEREF _Toc244249810 \h </w:instrText>
+              <w:instrText xml:space="preserve"> PAGEREF _Toc244253443 \h </w:instrText>
             </w:r>
             <w:r>
               <w:rPr>
@@ -1279,7 +1345,7 @@
               <w:rPr>
                 <w:noProof/>
               </w:rPr>
-              <w:t>19</w:t>
+              <w:t>22</w:t>
             </w:r>
             <w:r>
               <w:rPr>
@@ -1304,7 +1370,7 @@
               <w14:ligatures w14:val="standardContextual"/>
             </w:rPr>
           </w:pPr>
-          <w:hyperlink w:anchor="_Toc244249811" w:history="1">
+          <w:hyperlink w:anchor="_Toc244253444" w:history="1">
             <w:r>
               <w:rPr>
                 <w:rStyle w:val="Hipervnculo"/>
@@ -1328,7 +1394,7 @@
               <w:rPr>
                 <w:noProof/>
               </w:rPr>
-              <w:instrText xml:space="preserve"> PAGEREF _Toc244249811 \h </w:instrText>
+              <w:instrText xml:space="preserve"> PAGEREF _Toc244253444 \h </w:instrText>
             </w:r>
             <w:r>
               <w:rPr>
@@ -1345,7 +1411,7 @@
               <w:rPr>
                 <w:noProof/>
               </w:rPr>
-              <w:t>19</w:t>
+              <w:t>22</w:t>
             </w:r>
             <w:r>
               <w:rPr>
@@ -1370,7 +1436,7 @@
               <w14:ligatures w14:val="standardContextual"/>
             </w:rPr>
           </w:pPr>
-          <w:hyperlink w:anchor="_Toc244249812" w:history="1">
+          <w:hyperlink w:anchor="_Toc244253445" w:history="1">
             <w:r>
               <w:rPr>
                 <w:rStyle w:val="Hipervnculo"/>
@@ -1394,7 +1460,7 @@
               <w:rPr>
                 <w:noProof/>
               </w:rPr>
-              <w:instrText xml:space="preserve"> PAGEREF _Toc244249812 \h </w:instrText>
+              <w:instrText xml:space="preserve"> PAGEREF _Toc244253445 \h </w:instrText>
             </w:r>
             <w:r>
               <w:rPr>
@@ -1411,7 +1477,7 @@
               <w:rPr>
                 <w:noProof/>
               </w:rPr>
-              <w:t>19</w:t>
+              <w:t>22</w:t>
             </w:r>
             <w:r>
               <w:rPr>
@@ -1436,7 +1502,7 @@
               <w14:ligatures w14:val="standardContextual"/>
             </w:rPr>
           </w:pPr>
-          <w:hyperlink w:anchor="_Toc244249813" w:history="1">
+          <w:hyperlink w:anchor="_Toc244253446" w:history="1">
             <w:r>
               <w:rPr>
                 <w:rStyle w:val="Hipervnculo"/>
@@ -1460,7 +1526,7 @@
               <w:rPr>
                 <w:noProof/>
               </w:rPr>
-              <w:instrText xml:space="preserve"> PAGEREF _Toc244249813 \h </w:instrText>
+              <w:instrText xml:space="preserve"> PAGEREF _Toc244253446 \h </w:instrText>
             </w:r>
             <w:r>
               <w:rPr>
@@ -1477,7 +1543,7 @@
               <w:rPr>
                 <w:noProof/>
               </w:rPr>
-              <w:t>20</w:t>
+              <w:t>23</w:t>
             </w:r>
             <w:r>
               <w:rPr>
@@ -1502,7 +1568,7 @@
               <w14:ligatures w14:val="standardContextual"/>
             </w:rPr>
           </w:pPr>
-          <w:hyperlink w:anchor="_Toc244249814" w:history="1">
+          <w:hyperlink w:anchor="_Toc244253447" w:history="1">
             <w:r>
               <w:rPr>
                 <w:rStyle w:val="Hipervnculo"/>
@@ -1526,7 +1592,7 @@
               <w:rPr>
                 <w:noProof/>
               </w:rPr>
-              <w:instrText xml:space="preserve"> PAGEREF _Toc244249814 \h </w:instrText>
+              <w:instrText xml:space="preserve"> PAGEREF _Toc244253447 \h </w:instrText>
             </w:r>
             <w:r>
               <w:rPr>
@@ -1543,7 +1609,7 @@
               <w:rPr>
                 <w:noProof/>
               </w:rPr>
-              <w:t>21</w:t>
+              <w:t>24</w:t>
             </w:r>
             <w:r>
               <w:rPr>
@@ -1568,7 +1634,7 @@
               <w14:ligatures w14:val="standardContextual"/>
             </w:rPr>
           </w:pPr>
-          <w:hyperlink w:anchor="_Toc244249815" w:history="1">
+          <w:hyperlink w:anchor="_Toc244253448" w:history="1">
             <w:r>
               <w:rPr>
                 <w:rStyle w:val="Hipervnculo"/>
@@ -1592,7 +1658,7 @@
               <w:rPr>
                 <w:noProof/>
               </w:rPr>
-              <w:instrText xml:space="preserve"> PAGEREF _Toc244249815 \h </w:instrText>
+              <w:instrText xml:space="preserve"> PAGEREF _Toc244253448 \h </w:instrText>
             </w:r>
             <w:r>
               <w:rPr>
@@ -1609,7 +1675,7 @@
               <w:rPr>
                 <w:noProof/>
               </w:rPr>
-              <w:t>21</w:t>
+              <w:t>24</w:t>
             </w:r>
             <w:r>
               <w:rPr>
@@ -1634,7 +1700,7 @@
               <w14:ligatures w14:val="standardContextual"/>
             </w:rPr>
           </w:pPr>
-          <w:hyperlink w:anchor="_Toc244249816" w:history="1">
+          <w:hyperlink w:anchor="_Toc244253449" w:history="1">
             <w:r>
               <w:rPr>
                 <w:rStyle w:val="Hipervnculo"/>
@@ -1658,7 +1724,7 @@
               <w:rPr>
                 <w:noProof/>
               </w:rPr>
-              <w:instrText xml:space="preserve"> PAGEREF _Toc244249816 \h </w:instrText>
+              <w:instrText xml:space="preserve"> PAGEREF _Toc244253449 \h </w:instrText>
             </w:r>
             <w:r>
               <w:rPr>
@@ -1675,7 +1741,7 @@
               <w:rPr>
                 <w:noProof/>
               </w:rPr>
-              <w:t>21</w:t>
+              <w:t>24</w:t>
             </w:r>
             <w:r>
               <w:rPr>
@@ -1700,7 +1766,7 @@
               <w14:ligatures w14:val="standardContextual"/>
             </w:rPr>
           </w:pPr>
-          <w:hyperlink w:anchor="_Toc244249817" w:history="1">
+          <w:hyperlink w:anchor="_Toc244253450" w:history="1">
             <w:r>
               <w:rPr>
                 <w:rStyle w:val="Hipervnculo"/>
@@ -1724,7 +1790,7 @@
               <w:rPr>
                 <w:noProof/>
               </w:rPr>
-              <w:instrText xml:space="preserve"> PAGEREF _Toc244249817 \h </w:instrText>
+              <w:instrText xml:space="preserve"> PAGEREF _Toc244253450 \h </w:instrText>
             </w:r>
             <w:r>
               <w:rPr>
@@ -1741,7 +1807,7 @@
               <w:rPr>
                 <w:noProof/>
               </w:rPr>
-              <w:t>23</w:t>
+              <w:t>26</w:t>
             </w:r>
             <w:r>
               <w:rPr>
@@ -1766,7 +1832,7 @@
               <w14:ligatures w14:val="standardContextual"/>
             </w:rPr>
           </w:pPr>
-          <w:hyperlink w:anchor="_Toc244249818" w:history="1">
+          <w:hyperlink w:anchor="_Toc244253451" w:history="1">
             <w:r>
               <w:rPr>
                 <w:rStyle w:val="Hipervnculo"/>
@@ -1790,7 +1856,7 @@
               <w:rPr>
                 <w:noProof/>
               </w:rPr>
-              <w:instrText xml:space="preserve"> PAGEREF _Toc244249818 \h </w:instrText>
+              <w:instrText xml:space="preserve"> PAGEREF _Toc244253451 \h </w:instrText>
             </w:r>
             <w:r>
               <w:rPr>
@@ -1807,7 +1873,7 @@
               <w:rPr>
                 <w:noProof/>
               </w:rPr>
-              <w:t>23</w:t>
+              <w:t>26</w:t>
             </w:r>
             <w:r>
               <w:rPr>
@@ -1832,7 +1898,7 @@
               <w14:ligatures w14:val="standardContextual"/>
             </w:rPr>
           </w:pPr>
-          <w:hyperlink w:anchor="_Toc244249819" w:history="1">
+          <w:hyperlink w:anchor="_Toc244253452" w:history="1">
             <w:r>
               <w:rPr>
                 <w:rStyle w:val="Hipervnculo"/>
@@ -1856,7 +1922,7 @@
               <w:rPr>
                 <w:noProof/>
               </w:rPr>
-              <w:instrText xml:space="preserve"> PAGEREF _Toc244249819 \h </w:instrText>
+              <w:instrText xml:space="preserve"> PAGEREF _Toc244253452 \h </w:instrText>
             </w:r>
             <w:r>
               <w:rPr>
@@ -1873,7 +1939,7 @@
               <w:rPr>
                 <w:noProof/>
               </w:rPr>
-              <w:t>23</w:t>
+              <w:t>26</w:t>
             </w:r>
             <w:r>
               <w:rPr>
@@ -1898,7 +1964,7 @@
               <w14:ligatures w14:val="standardContextual"/>
             </w:rPr>
           </w:pPr>
-          <w:hyperlink w:anchor="_Toc244249820" w:history="1">
+          <w:hyperlink w:anchor="_Toc244253453" w:history="1">
             <w:r>
               <w:rPr>
                 <w:rStyle w:val="Hipervnculo"/>
@@ -1938,7 +2004,7 @@
               <w:rPr>
                 <w:noProof/>
               </w:rPr>
-              <w:instrText xml:space="preserve"> PAGEREF _Toc244249820 \h </w:instrText>
+              <w:instrText xml:space="preserve"> PAGEREF _Toc244253453 \h </w:instrText>
             </w:r>
             <w:r>
               <w:rPr>
@@ -1955,7 +2021,7 @@
               <w:rPr>
                 <w:noProof/>
               </w:rPr>
-              <w:t>23</w:t>
+              <w:t>26</w:t>
             </w:r>
             <w:r>
               <w:rPr>
@@ -1980,7 +2046,7 @@
               <w14:ligatures w14:val="standardContextual"/>
             </w:rPr>
           </w:pPr>
-          <w:hyperlink w:anchor="_Toc244249821" w:history="1">
+          <w:hyperlink w:anchor="_Toc244253454" w:history="1">
             <w:r>
               <w:rPr>
                 <w:rStyle w:val="Hipervnculo"/>
@@ -2052,7 +2118,7 @@
               <w:rPr>
                 <w:noProof/>
               </w:rPr>
-              <w:instrText xml:space="preserve"> PAGEREF _Toc244249821 \h </w:instrText>
+              <w:instrText xml:space="preserve"> PAGEREF _Toc244253454 \h </w:instrText>
             </w:r>
             <w:r>
               <w:rPr>
@@ -2069,7 +2135,7 @@
               <w:rPr>
                 <w:noProof/>
               </w:rPr>
-              <w:t>24</w:t>
+              <w:t>27</w:t>
             </w:r>
             <w:r>
               <w:rPr>
@@ -2094,7 +2160,7 @@
               <w14:ligatures w14:val="standardContextual"/>
             </w:rPr>
           </w:pPr>
-          <w:hyperlink w:anchor="_Toc244249822" w:history="1">
+          <w:hyperlink w:anchor="_Toc244253455" w:history="1">
             <w:r>
               <w:rPr>
                 <w:rStyle w:val="Hipervnculo"/>
@@ -2118,7 +2184,7 @@
               <w:rPr>
                 <w:noProof/>
               </w:rPr>
-              <w:instrText xml:space="preserve"> PAGEREF _Toc244249822 \h </w:instrText>
+              <w:instrText xml:space="preserve"> PAGEREF _Toc244253455 \h </w:instrText>
             </w:r>
             <w:r>
               <w:rPr>
@@ -2135,7 +2201,7 @@
               <w:rPr>
                 <w:noProof/>
               </w:rPr>
-              <w:t>24</w:t>
+              <w:t>27</w:t>
             </w:r>
             <w:r>
               <w:rPr>
@@ -2160,7 +2226,7 @@
               <w14:ligatures w14:val="standardContextual"/>
             </w:rPr>
           </w:pPr>
-          <w:hyperlink w:anchor="_Toc244249823" w:history="1">
+          <w:hyperlink w:anchor="_Toc244253456" w:history="1">
             <w:r>
               <w:rPr>
                 <w:rStyle w:val="Hipervnculo"/>
@@ -2184,7 +2250,7 @@
               <w:rPr>
                 <w:noProof/>
               </w:rPr>
-              <w:instrText xml:space="preserve"> PAGEREF _Toc244249823 \h </w:instrText>
+              <w:instrText xml:space="preserve"> PAGEREF _Toc244253456 \h </w:instrText>
             </w:r>
             <w:r>
               <w:rPr>
@@ -2201,7 +2267,7 @@
               <w:rPr>
                 <w:noProof/>
               </w:rPr>
-              <w:t>24</w:t>
+              <w:t>27</w:t>
             </w:r>
             <w:r>
               <w:rPr>
@@ -2226,7 +2292,7 @@
               <w14:ligatures w14:val="standardContextual"/>
             </w:rPr>
           </w:pPr>
-          <w:hyperlink w:anchor="_Toc244249824" w:history="1">
+          <w:hyperlink w:anchor="_Toc244253457" w:history="1">
             <w:r>
               <w:rPr>
                 <w:rStyle w:val="Hipervnculo"/>
@@ -2250,7 +2316,7 @@
               <w:rPr>
                 <w:noProof/>
               </w:rPr>
-              <w:instrText xml:space="preserve"> PAGEREF _Toc244249824 \h </w:instrText>
+              <w:instrText xml:space="preserve"> PAGEREF _Toc244253457 \h </w:instrText>
             </w:r>
             <w:r>
               <w:rPr>
@@ -2267,7 +2333,7 @@
               <w:rPr>
                 <w:noProof/>
               </w:rPr>
-              <w:t>24</w:t>
+              <w:t>27</w:t>
             </w:r>
             <w:r>
               <w:rPr>
@@ -2292,7 +2358,7 @@
               <w14:ligatures w14:val="standardContextual"/>
             </w:rPr>
           </w:pPr>
-          <w:hyperlink w:anchor="_Toc244249825" w:history="1">
+          <w:hyperlink w:anchor="_Toc244253458" w:history="1">
             <w:r>
               <w:rPr>
                 <w:rStyle w:val="Hipervnculo"/>
@@ -2316,7 +2382,7 @@
               <w:rPr>
                 <w:noProof/>
               </w:rPr>
-              <w:instrText xml:space="preserve"> PAGEREF _Toc244249825 \h </w:instrText>
+              <w:instrText xml:space="preserve"> PAGEREF _Toc244253458 \h </w:instrText>
             </w:r>
             <w:r>
               <w:rPr>
@@ -2333,7 +2399,7 @@
               <w:rPr>
                 <w:noProof/>
               </w:rPr>
-              <w:t>24</w:t>
+              <w:t>27</w:t>
             </w:r>
             <w:r>
               <w:rPr>
@@ -2358,7 +2424,7 @@
               <w14:ligatures w14:val="standardContextual"/>
             </w:rPr>
           </w:pPr>
-          <w:hyperlink w:anchor="_Toc244249826" w:history="1">
+          <w:hyperlink w:anchor="_Toc244253459" w:history="1">
             <w:r>
               <w:rPr>
                 <w:rStyle w:val="Hipervnculo"/>
@@ -2382,7 +2448,7 @@
               <w:rPr>
                 <w:noProof/>
               </w:rPr>
-              <w:instrText xml:space="preserve"> PAGEREF _Toc244249826 \h </w:instrText>
+              <w:instrText xml:space="preserve"> PAGEREF _Toc244253459 \h </w:instrText>
             </w:r>
             <w:r>
               <w:rPr>
@@ -2399,7 +2465,7 @@
               <w:rPr>
                 <w:noProof/>
               </w:rPr>
-              <w:t>25</w:t>
+              <w:t>28</w:t>
             </w:r>
             <w:r>
               <w:rPr>
@@ -2424,7 +2490,7 @@
               <w14:ligatures w14:val="standardContextual"/>
             </w:rPr>
           </w:pPr>
-          <w:hyperlink w:anchor="_Toc244249827" w:history="1">
+          <w:hyperlink w:anchor="_Toc244253460" w:history="1">
             <w:r>
               <w:rPr>
                 <w:rStyle w:val="Hipervnculo"/>
@@ -2448,7 +2514,7 @@
               <w:rPr>
                 <w:noProof/>
               </w:rPr>
-              <w:instrText xml:space="preserve"> PAGEREF _Toc244249827 \h </w:instrText>
+              <w:instrText xml:space="preserve"> PAGEREF _Toc244253460 \h </w:instrText>
             </w:r>
             <w:r>
               <w:rPr>
@@ -2465,7 +2531,7 @@
               <w:rPr>
                 <w:noProof/>
               </w:rPr>
-              <w:t>26</w:t>
+              <w:t>29</w:t>
             </w:r>
             <w:r>
               <w:rPr>
@@ -2490,7 +2556,7 @@
               <w14:ligatures w14:val="standardContextual"/>
             </w:rPr>
           </w:pPr>
-          <w:hyperlink w:anchor="_Toc244249828" w:history="1">
+          <w:hyperlink w:anchor="_Toc244253461" w:history="1">
             <w:r>
               <w:rPr>
                 <w:rStyle w:val="Hipervnculo"/>
@@ -2546,7 +2612,7 @@
               <w:rPr>
                 <w:noProof/>
               </w:rPr>
-              <w:instrText xml:space="preserve"> PAGEREF _Toc244249828 \h </w:instrText>
+              <w:instrText xml:space="preserve"> PAGEREF _Toc244253461 \h </w:instrText>
             </w:r>
             <w:r>
               <w:rPr>
@@ -2563,7 +2629,7 @@
               <w:rPr>
                 <w:noProof/>
               </w:rPr>
-              <w:t>26</w:t>
+              <w:t>29</w:t>
             </w:r>
             <w:r>
               <w:rPr>
@@ -2585,7 +2651,7 @@
         <w:pStyle w:val="Ttulo1"/>
         <w:pageBreakBefore/>
       </w:pPr>
-      <w:bookmarkStart w:id="0" w:name="_Toc244249793"/>
+      <w:bookmarkStart w:id="0" w:name="_Toc244253425"/>
       <w:r>
         <w:t>Notas de avance — Obligatorio (para repasar antes de la defensa)</w:t>
       </w:r>
@@ -2703,7 +2769,7 @@
       <w:pPr>
         <w:pStyle w:val="Ttulo2"/>
       </w:pPr>
-      <w:bookmarkStart w:id="1" w:name="_Toc244249794"/>
+      <w:bookmarkStart w:id="1" w:name="_Toc244253426"/>
       <w:r>
         <w:t>Resumen rápido de bugs encontrados (para repasar de un vistazo)</w:t>
       </w:r>
@@ -5200,7 +5266,7 @@
       <w:pPr>
         <w:pStyle w:val="Ttulo2"/>
       </w:pPr>
-      <w:bookmarkStart w:id="2" w:name="_Toc244249795"/>
+      <w:bookmarkStart w:id="2" w:name="_Toc244253427"/>
       <w:r>
         <w:t>Arquitectura de la solución final (RF06 en adelante)</w:t>
       </w:r>
@@ -5270,7 +5336,7 @@
       <w:pPr>
         <w:pStyle w:val="Ttulo2"/>
       </w:pPr>
-      <w:bookmarkStart w:id="3" w:name="_Toc244249796"/>
+      <w:bookmarkStart w:id="3" w:name="_Toc244253428"/>
       <w:r>
         <w:t>RF06 — Login de usuarios (Web API + JWT)</w:t>
       </w:r>
@@ -5804,7 +5870,7 @@
       <w:pPr>
         <w:pStyle w:val="Ttulo2"/>
       </w:pPr>
-      <w:bookmarkStart w:id="4" w:name="_Toc244249797"/>
+      <w:bookmarkStart w:id="4" w:name="_Toc244253429"/>
       <w:r>
         <w:t>RF01 — Login de administradores</w:t>
       </w:r>
@@ -6201,7 +6267,7 @@
       <w:pPr>
         <w:pStyle w:val="Ttulo2"/>
       </w:pPr>
-      <w:bookmarkStart w:id="5" w:name="_Toc244249798"/>
+      <w:bookmarkStart w:id="5" w:name="_Toc244253430"/>
       <w:r>
         <w:t>RF02 — Alta de usuarios</w:t>
       </w:r>
@@ -6239,7 +6305,7 @@
       <w:pPr>
         <w:pStyle w:val="Ttulo2"/>
       </w:pPr>
-      <w:bookmarkStart w:id="6" w:name="_Toc244249799"/>
+      <w:bookmarkStart w:id="6" w:name="_Toc244253431"/>
       <w:r>
         <w:t>RF03 — Gestión de historias (CRUD sin Delete)</w:t>
       </w:r>
@@ -6309,7 +6375,7 @@
       <w:pPr>
         <w:pStyle w:val="Ttulo2"/>
       </w:pPr>
-      <w:bookmarkStart w:id="7" w:name="_Toc244249800"/>
+      <w:bookmarkStart w:id="7" w:name="_Toc244253432"/>
       <w:r>
         <w:t>RF04 — Alta de capítulos intermedios y finales</w:t>
       </w:r>
@@ -6669,7 +6735,7 @@
       <w:pPr>
         <w:pStyle w:val="Ttulo2"/>
       </w:pPr>
-      <w:bookmarkStart w:id="8" w:name="_Toc244249801"/>
+      <w:bookmarkStart w:id="8" w:name="_Toc244253433"/>
       <w:r>
         <w:t>RF05 — Auditoría de historias</w:t>
       </w:r>
@@ -7443,7 +7509,7 @@
       <w:pPr>
         <w:pStyle w:val="Ttulo2"/>
       </w:pPr>
-      <w:bookmarkStart w:id="9" w:name="_Toc244249802"/>
+      <w:bookmarkStart w:id="9" w:name="_Toc244253434"/>
       <w:r>
         <w:t>RF07 — Lectura de historia (Rol Usuario)</w:t>
       </w:r>
@@ -8246,7 +8312,7 @@
       <w:pPr>
         <w:pStyle w:val="Ttulo2"/>
       </w:pPr>
-      <w:bookmarkStart w:id="10" w:name="_Toc244249803"/>
+      <w:bookmarkStart w:id="10" w:name="_Toc244253435"/>
       <w:r>
         <w:t>RF08 — Historial de lecturas (Rol Usuario)</w:t>
       </w:r>
@@ -8513,7 +8579,7 @@
       <w:pPr>
         <w:pStyle w:val="Ttulo2"/>
       </w:pPr>
-      <w:bookmarkStart w:id="11" w:name="_Toc244249804"/>
+      <w:bookmarkStart w:id="11" w:name="_Toc244253436"/>
       <w:r>
         <w:t>Cliente MVC de Lectura (</w:t>
       </w:r>
@@ -9400,7 +9466,7 @@
       <w:pPr>
         <w:pStyle w:val="Ttulo2"/>
       </w:pPr>
-      <w:bookmarkStart w:id="12" w:name="_Toc244249805"/>
+      <w:bookmarkStart w:id="12" w:name="_Toc244253437"/>
       <w:r>
         <w:t>RF09 — Ranking de historias más leídas (Rol Administrador)</w:t>
       </w:r>
@@ -10554,7 +10620,7 @@
       <w:pPr>
         <w:pStyle w:val="Ttulo2"/>
       </w:pPr>
-      <w:bookmarkStart w:id="13" w:name="_Toc244249806"/>
+      <w:bookmarkStart w:id="13" w:name="_Toc244253438"/>
       <w:r>
         <w:t>RF10 — Final más alcanzado por historia (Rol Administrador)</w:t>
       </w:r>
@@ -11727,7 +11793,7 @@
       <w:pPr>
         <w:pStyle w:val="Ttulo2"/>
       </w:pPr>
-      <w:bookmarkStart w:id="14" w:name="_Toc244249807"/>
+      <w:bookmarkStart w:id="14" w:name="_Toc244253439"/>
       <w:r>
         <w:t>RF11 — Usuario con más historias leídas (Rol Administrador)</w:t>
       </w:r>
@@ -13569,7 +13635,7 @@
       <w:pPr>
         <w:pStyle w:val="Ttulo2"/>
       </w:pPr>
-      <w:bookmarkStart w:id="15" w:name="_Toc244249808"/>
+      <w:bookmarkStart w:id="15" w:name="_Toc244253440"/>
       <w:r>
         <w:t>RF12 — Selección de estilo de lectura (Rol Usuario = Lector)</w:t>
       </w:r>
@@ -14894,7 +14960,7 @@
       <w:pPr>
         <w:pStyle w:val="Ttulo2"/>
       </w:pPr>
-      <w:bookmarkStart w:id="16" w:name="_Toc244249809"/>
+      <w:bookmarkStart w:id="16" w:name="_Toc244253441"/>
       <w:r>
         <w:t>Datos de prueba (30/10) — base para el punto C.g del informe</w:t>
       </w:r>
@@ -16080,35 +16146,6 @@
     </w:p>
     <w:p>
       <w:pPr>
-        <w:pStyle w:val="Ttulo1"/>
-        <w:pageBreakBefore/>
-      </w:pPr>
-      <w:bookmarkStart w:id="17" w:name="_Toc244249810"/>
-      <w:r>
-        <w:t>Investigación RF12 — Selección de estilo de lectura</w:t>
-      </w:r>
-      <w:bookmarkEnd w:id="17"/>
-    </w:p>
-    <w:p>
-      <w:pPr>
-        <w:spacing w:after="140"/>
-      </w:pPr>
-      <w:r>
-        <w:t xml:space="preserve">Base para el punto </w:t>
-      </w:r>
-      <w:r>
-        <w:rPr>
-          <w:b/>
-          <w:bCs/>
-        </w:rPr>
-        <w:t>C.h del informe</w:t>
-      </w:r>
-      <w:r>
-        <w:t xml:space="preserve"> ("Documentar la investigación realizada para implementar la selección de estilos"). El enunciado pide investigar el tema por cuenta propia, apoyándose en una herramienta de IA generativa, y documentar la investigación y cómo se decidió implementarlo. Esto es un borrador: pasarlo al informe con sus palabras.</w:t>
-      </w:r>
-    </w:p>
-    <w:p>
-      <w:pPr>
         <w:pBdr>
           <w:bottom w:val="single" w:sz="6" w:space="1" w:color="BFBFCF"/>
         </w:pBdr>
@@ -16119,11 +16156,1595 @@
       <w:pPr>
         <w:pStyle w:val="Ttulo2"/>
       </w:pPr>
-      <w:bookmarkStart w:id="18" w:name="_Toc244249811"/>
+      <w:bookmarkStart w:id="17" w:name="_Toc244253442"/>
+      <w:r>
+        <w:t>Excepciones — alineadas con RedSocial (30/10)</w:t>
+      </w:r>
+      <w:bookmarkEnd w:id="17"/>
+    </w:p>
+    <w:p>
+      <w:pPr>
+        <w:spacing w:after="140"/>
+      </w:pPr>
+      <w:r>
+        <w:rPr>
+          <w:b/>
+          <w:bCs/>
+        </w:rPr>
+        <w:t>Pregunta típica de defensa: "¿cómo manejan los errores?"</w:t>
+      </w:r>
+      <w:r>
+        <w:t xml:space="preserve"> Se revisó todo el proyecto y se dejó el manejo de excepciones igual al que muestra el profe en RedSocialM3C.</w:t>
+      </w:r>
+    </w:p>
+    <w:p>
+      <w:pPr>
+        <w:pStyle w:val="Ttulo3"/>
+      </w:pPr>
+      <w:r>
+        <w:t>Las clases (Dominio/Excepciones)</w:t>
+      </w:r>
+    </w:p>
+    <w:p>
+      <w:pPr>
+        <w:spacing w:after="140"/>
+      </w:pPr>
+      <w:r>
+        <w:t xml:space="preserve">Una excepción </w:t>
+      </w:r>
+      <w:r>
+        <w:rPr>
+          <w:b/>
+          <w:bCs/>
+        </w:rPr>
+        <w:t>por entidad</w:t>
+      </w:r>
+      <w:r>
+        <w:t xml:space="preserve">: </w:t>
+      </w:r>
+      <w:r>
+        <w:rPr>
+          <w:rFonts w:ascii="Consolas" w:eastAsia="Consolas" w:hAnsi="Consolas" w:cs="Consolas"/>
+          <w:sz w:val="19"/>
+          <w:szCs w:val="19"/>
+          <w:shd w:val="clear" w:color="auto" w:fill="EEEEF3"/>
+        </w:rPr>
+        <w:t>UsuarioException</w:t>
+      </w:r>
+      <w:r>
+        <w:t xml:space="preserve">, </w:t>
+      </w:r>
+      <w:r>
+        <w:rPr>
+          <w:rFonts w:ascii="Consolas" w:eastAsia="Consolas" w:hAnsi="Consolas" w:cs="Consolas"/>
+          <w:sz w:val="19"/>
+          <w:szCs w:val="19"/>
+          <w:shd w:val="clear" w:color="auto" w:fill="EEEEF3"/>
+        </w:rPr>
+        <w:t>CategoriaException</w:t>
+      </w:r>
+      <w:r>
+        <w:t xml:space="preserve">, </w:t>
+      </w:r>
+      <w:r>
+        <w:rPr>
+          <w:rFonts w:ascii="Consolas" w:eastAsia="Consolas" w:hAnsi="Consolas" w:cs="Consolas"/>
+          <w:sz w:val="19"/>
+          <w:szCs w:val="19"/>
+          <w:shd w:val="clear" w:color="auto" w:fill="EEEEF3"/>
+        </w:rPr>
+        <w:t>HistoriaException</w:t>
+      </w:r>
+      <w:r>
+        <w:t xml:space="preserve">, </w:t>
+      </w:r>
+      <w:r>
+        <w:rPr>
+          <w:rFonts w:ascii="Consolas" w:eastAsia="Consolas" w:hAnsi="Consolas" w:cs="Consolas"/>
+          <w:sz w:val="19"/>
+          <w:szCs w:val="19"/>
+          <w:shd w:val="clear" w:color="auto" w:fill="EEEEF3"/>
+        </w:rPr>
+        <w:t>LecturaException</w:t>
+      </w:r>
+      <w:r>
+        <w:t xml:space="preserve">, </w:t>
+      </w:r>
+      <w:r>
+        <w:rPr>
+          <w:rFonts w:ascii="Consolas" w:eastAsia="Consolas" w:hAnsi="Consolas" w:cs="Consolas"/>
+          <w:sz w:val="19"/>
+          <w:szCs w:val="19"/>
+          <w:shd w:val="clear" w:color="auto" w:fill="EEEEF3"/>
+        </w:rPr>
+        <w:t>AuditoriaException</w:t>
+      </w:r>
+      <w:r>
+        <w:t xml:space="preserve">. Cada una hereda </w:t>
+      </w:r>
+      <w:r>
+        <w:rPr>
+          <w:b/>
+          <w:bCs/>
+        </w:rPr>
+        <w:t xml:space="preserve">directo de </w:t>
+      </w:r>
+      <w:r>
+        <w:rPr>
+          <w:rFonts w:ascii="Consolas" w:eastAsia="Consolas" w:hAnsi="Consolas" w:cs="Consolas"/>
+          <w:b/>
+          <w:bCs/>
+          <w:sz w:val="19"/>
+          <w:szCs w:val="19"/>
+          <w:shd w:val="clear" w:color="auto" w:fill="EEEEF3"/>
+        </w:rPr>
+        <w:t>Exception</w:t>
+      </w:r>
+      <w:r>
+        <w:t>, con los 3 constructores (vacío, con mensaje, con mensaje + excepción interna), igual que en RedSocial.</w:t>
+      </w:r>
+    </w:p>
+    <w:p>
+      <w:pPr>
+        <w:pStyle w:val="Prrafodelista"/>
+        <w:numPr>
+          <w:ilvl w:val="0"/>
+          <w:numId w:val="3"/>
+        </w:numPr>
+        <w:spacing w:after="60"/>
+      </w:pPr>
+      <w:r>
+        <w:t xml:space="preserve">Antes había una clase base </w:t>
+      </w:r>
+      <w:r>
+        <w:rPr>
+          <w:rFonts w:ascii="Consolas" w:eastAsia="Consolas" w:hAnsi="Consolas" w:cs="Consolas"/>
+          <w:sz w:val="19"/>
+          <w:szCs w:val="19"/>
+          <w:shd w:val="clear" w:color="auto" w:fill="EEEEF3"/>
+        </w:rPr>
+        <w:t>DomainException</w:t>
+      </w:r>
+      <w:r>
+        <w:t xml:space="preserve"> en el medio. Se </w:t>
+      </w:r>
+      <w:r>
+        <w:rPr>
+          <w:b/>
+          <w:bCs/>
+        </w:rPr>
+        <w:t>sacó</w:t>
+      </w:r>
+      <w:r>
+        <w:t xml:space="preserve"> para quedar igual que el profe. La consecuencia: ahora cada controller atrapa la excepción </w:t>
+      </w:r>
+      <w:r>
+        <w:rPr>
+          <w:b/>
+          <w:bCs/>
+        </w:rPr>
+        <w:t>específica</w:t>
+      </w:r>
+      <w:r>
+        <w:t xml:space="preserve"> de lo que maneja (por ejemplo, </w:t>
+      </w:r>
+      <w:r>
+        <w:rPr>
+          <w:rFonts w:ascii="Consolas" w:eastAsia="Consolas" w:hAnsi="Consolas" w:cs="Consolas"/>
+          <w:sz w:val="19"/>
+          <w:szCs w:val="19"/>
+          <w:shd w:val="clear" w:color="auto" w:fill="EEEEF3"/>
+        </w:rPr>
+        <w:t>HistoriaController</w:t>
+      </w:r>
+      <w:r>
+        <w:t xml:space="preserve"> atrapa </w:t>
+      </w:r>
+      <w:r>
+        <w:rPr>
+          <w:rFonts w:ascii="Consolas" w:eastAsia="Consolas" w:hAnsi="Consolas" w:cs="Consolas"/>
+          <w:sz w:val="19"/>
+          <w:szCs w:val="19"/>
+          <w:shd w:val="clear" w:color="auto" w:fill="EEEEF3"/>
+        </w:rPr>
+        <w:t>HistoriaException</w:t>
+      </w:r>
+      <w:r>
+        <w:t>), en vez de una genérica para todas.</w:t>
+      </w:r>
+    </w:p>
+    <w:p>
+      <w:pPr>
+        <w:pStyle w:val="Prrafodelista"/>
+        <w:numPr>
+          <w:ilvl w:val="0"/>
+          <w:numId w:val="3"/>
+        </w:numPr>
+        <w:spacing w:after="60"/>
+      </w:pPr>
+      <w:r>
+        <w:rPr>
+          <w:rFonts w:ascii="Consolas" w:eastAsia="Consolas" w:hAnsi="Consolas" w:cs="Consolas"/>
+          <w:sz w:val="19"/>
+          <w:szCs w:val="19"/>
+          <w:shd w:val="clear" w:color="auto" w:fill="EEEEF3"/>
+        </w:rPr>
+        <w:t>Capitulo</w:t>
+      </w:r>
+      <w:r>
+        <w:t xml:space="preserve"> y </w:t>
+      </w:r>
+      <w:r>
+        <w:rPr>
+          <w:rFonts w:ascii="Consolas" w:eastAsia="Consolas" w:hAnsi="Consolas" w:cs="Consolas"/>
+          <w:sz w:val="19"/>
+          <w:szCs w:val="19"/>
+          <w:shd w:val="clear" w:color="auto" w:fill="EEEEF3"/>
+        </w:rPr>
+        <w:t>Opcion</w:t>
+      </w:r>
+      <w:r>
+        <w:t xml:space="preserve"> usan </w:t>
+      </w:r>
+      <w:r>
+        <w:rPr>
+          <w:rFonts w:ascii="Consolas" w:eastAsia="Consolas" w:hAnsi="Consolas" w:cs="Consolas"/>
+          <w:sz w:val="19"/>
+          <w:szCs w:val="19"/>
+          <w:shd w:val="clear" w:color="auto" w:fill="EEEEF3"/>
+        </w:rPr>
+        <w:t>HistoriaException</w:t>
+      </w:r>
+      <w:r>
+        <w:t xml:space="preserve"> porque no tienen repositorio propio: son parte del agregado Historia.</w:t>
+      </w:r>
+    </w:p>
+    <w:p>
+      <w:pPr>
+        <w:pStyle w:val="Ttulo3"/>
+      </w:pPr>
+      <w:r>
+        <w:t>Dónde se lanzan</w:t>
+      </w:r>
+    </w:p>
+    <w:p>
+      <w:pPr>
+        <w:pStyle w:val="Prrafodelista"/>
+        <w:numPr>
+          <w:ilvl w:val="0"/>
+          <w:numId w:val="3"/>
+        </w:numPr>
+        <w:spacing w:after="60"/>
+      </w:pPr>
+      <w:r>
+        <w:rPr>
+          <w:b/>
+          <w:bCs/>
+        </w:rPr>
+        <w:t>Entidades y value objects</w:t>
+      </w:r>
+      <w:r>
+        <w:t xml:space="preserve"> (</w:t>
+      </w:r>
+      <w:r>
+        <w:rPr>
+          <w:rFonts w:ascii="Consolas" w:eastAsia="Consolas" w:hAnsi="Consolas" w:cs="Consolas"/>
+          <w:sz w:val="19"/>
+          <w:szCs w:val="19"/>
+          <w:shd w:val="clear" w:color="auto" w:fill="EEEEF3"/>
+        </w:rPr>
+        <w:t>Validar()</w:t>
+      </w:r>
+      <w:r>
+        <w:t xml:space="preserve">): por ejemplo </w:t>
+      </w:r>
+      <w:r>
+        <w:rPr>
+          <w:rFonts w:ascii="Consolas" w:eastAsia="Consolas" w:hAnsi="Consolas" w:cs="Consolas"/>
+          <w:sz w:val="19"/>
+          <w:szCs w:val="19"/>
+          <w:shd w:val="clear" w:color="auto" w:fill="EEEEF3"/>
+        </w:rPr>
+        <w:t>Password</w:t>
+      </w:r>
+      <w:r>
+        <w:t xml:space="preserve"> lanza </w:t>
+      </w:r>
+      <w:r>
+        <w:rPr>
+          <w:rFonts w:ascii="Consolas" w:eastAsia="Consolas" w:hAnsi="Consolas" w:cs="Consolas"/>
+          <w:sz w:val="19"/>
+          <w:szCs w:val="19"/>
+          <w:shd w:val="clear" w:color="auto" w:fill="EEEEF3"/>
+        </w:rPr>
+        <w:t>UsuarioException</w:t>
+      </w:r>
+      <w:r>
+        <w:t xml:space="preserve"> si no tiene mayúscula.</w:t>
+      </w:r>
+    </w:p>
+    <w:p>
+      <w:pPr>
+        <w:pStyle w:val="Prrafodelista"/>
+        <w:numPr>
+          <w:ilvl w:val="0"/>
+          <w:numId w:val="3"/>
+        </w:numPr>
+        <w:spacing w:after="60"/>
+      </w:pPr>
+      <w:r>
+        <w:rPr>
+          <w:b/>
+          <w:bCs/>
+        </w:rPr>
+        <w:t>Casos de uso</w:t>
+      </w:r>
+      <w:r>
+        <w:t xml:space="preserve">: reglas de negocio y "no encontrado" (por ejemplo </w:t>
+      </w:r>
+      <w:r>
+        <w:rPr>
+          <w:rFonts w:ascii="Consolas" w:eastAsia="Consolas" w:hAnsi="Consolas" w:cs="Consolas"/>
+          <w:sz w:val="19"/>
+          <w:szCs w:val="19"/>
+          <w:shd w:val="clear" w:color="auto" w:fill="EEEEF3"/>
+        </w:rPr>
+        <w:t>AvanzarLecturaCU</w:t>
+      </w:r>
+      <w:r>
+        <w:t xml:space="preserve"> lanza </w:t>
+      </w:r>
+      <w:r>
+        <w:rPr>
+          <w:rFonts w:ascii="Consolas" w:eastAsia="Consolas" w:hAnsi="Consolas" w:cs="Consolas"/>
+          <w:sz w:val="19"/>
+          <w:szCs w:val="19"/>
+          <w:shd w:val="clear" w:color="auto" w:fill="EEEEF3"/>
+        </w:rPr>
+        <w:t>LecturaException("Esta lectura no te pertenece.")</w:t>
+      </w:r>
+      <w:r>
+        <w:t>).</w:t>
+      </w:r>
+    </w:p>
+    <w:p>
+      <w:pPr>
+        <w:pStyle w:val="Prrafodelista"/>
+        <w:numPr>
+          <w:ilvl w:val="0"/>
+          <w:numId w:val="3"/>
+        </w:numPr>
+        <w:spacing w:after="60"/>
+      </w:pPr>
+      <w:r>
+        <w:rPr>
+          <w:b/>
+          <w:bCs/>
+        </w:rPr>
+        <w:t>Repositorios EF</w:t>
+      </w:r>
+      <w:r>
+        <w:t xml:space="preserve">: si falla </w:t>
+      </w:r>
+      <w:r>
+        <w:rPr>
+          <w:rFonts w:ascii="Consolas" w:eastAsia="Consolas" w:hAnsi="Consolas" w:cs="Consolas"/>
+          <w:sz w:val="19"/>
+          <w:szCs w:val="19"/>
+          <w:shd w:val="clear" w:color="auto" w:fill="EEEEF3"/>
+        </w:rPr>
+        <w:t>SaveChanges</w:t>
+      </w:r>
+      <w:r>
+        <w:t xml:space="preserve"> (la base se cayó, se violó una FK...) se atrapa y se relanza como la excepción propia: </w:t>
+      </w:r>
+      <w:r>
+        <w:rPr>
+          <w:rFonts w:ascii="Consolas" w:eastAsia="Consolas" w:hAnsi="Consolas" w:cs="Consolas"/>
+          <w:sz w:val="19"/>
+          <w:szCs w:val="19"/>
+          <w:shd w:val="clear" w:color="auto" w:fill="EEEEF3"/>
+        </w:rPr>
+        <w:t>throw new HistoriaException("Error al guardar en la base de datos.")</w:t>
+      </w:r>
+      <w:r>
+        <w:t xml:space="preserve">. Es lo mismo que hace el profe en </w:t>
+      </w:r>
+      <w:r>
+        <w:rPr>
+          <w:rFonts w:ascii="Consolas" w:eastAsia="Consolas" w:hAnsi="Consolas" w:cs="Consolas"/>
+          <w:sz w:val="19"/>
+          <w:szCs w:val="19"/>
+          <w:shd w:val="clear" w:color="auto" w:fill="EEEEF3"/>
+        </w:rPr>
+        <w:t>RepositorioUsuarioEF.Add</w:t>
+      </w:r>
+      <w:r>
+        <w:t xml:space="preserve">. </w:t>
+      </w:r>
+      <w:r>
+        <w:rPr>
+          <w:b/>
+          <w:bCs/>
+        </w:rPr>
+        <w:t>Por qué:</w:t>
+      </w:r>
+      <w:r>
+        <w:t xml:space="preserve"> la capa de arriba no tiene que saber nada de Entity Framework. Le llega "la excepción de Historia", no una </w:t>
+      </w:r>
+      <w:r>
+        <w:rPr>
+          <w:rFonts w:ascii="Consolas" w:eastAsia="Consolas" w:hAnsi="Consolas" w:cs="Consolas"/>
+          <w:sz w:val="19"/>
+          <w:szCs w:val="19"/>
+          <w:shd w:val="clear" w:color="auto" w:fill="EEEEF3"/>
+        </w:rPr>
+        <w:t>DbUpdateException</w:t>
+      </w:r>
+      <w:r>
+        <w:t>.</w:t>
+      </w:r>
+    </w:p>
+    <w:p>
+      <w:pPr>
+        <w:pStyle w:val="Ttulo3"/>
+      </w:pPr>
+      <w:r>
+        <w:t xml:space="preserve">Dónde se atrapan: siempre dos </w:t>
+      </w:r>
+      <w:r>
+        <w:rPr>
+          <w:rFonts w:ascii="Consolas" w:eastAsia="Consolas" w:hAnsi="Consolas" w:cs="Consolas"/>
+          <w:sz w:val="19"/>
+          <w:szCs w:val="19"/>
+          <w:shd w:val="clear" w:color="auto" w:fill="EEEEF3"/>
+        </w:rPr>
+        <w:t>catch</w:t>
+      </w:r>
+      <w:r>
+        <w:t>, primero el específico</w:t>
+      </w:r>
+    </w:p>
+    <w:p>
+      <w:pPr>
+        <w:shd w:val="clear" w:color="auto" w:fill="F2F2F6"/>
+        <w:spacing w:before="80"/>
+        <w:ind w:left="200"/>
+      </w:pPr>
+      <w:r>
+        <w:rPr>
+          <w:rFonts w:ascii="Consolas" w:eastAsia="Consolas" w:hAnsi="Consolas" w:cs="Consolas"/>
+          <w:sz w:val="18"/>
+          <w:szCs w:val="18"/>
+        </w:rPr>
+        <w:t>try { ... }</w:t>
+      </w:r>
+    </w:p>
+    <w:p>
+      <w:pPr>
+        <w:shd w:val="clear" w:color="auto" w:fill="F2F2F6"/>
+        <w:ind w:left="200"/>
+      </w:pPr>
+      <w:r>
+        <w:rPr>
+          <w:rFonts w:ascii="Consolas" w:eastAsia="Consolas" w:hAnsi="Consolas" w:cs="Consolas"/>
+          <w:sz w:val="18"/>
+          <w:szCs w:val="18"/>
+        </w:rPr>
+        <w:t>catch (HistoriaException hex)   // error "esperado": regla de negocio, dato inválido, no existe</w:t>
+      </w:r>
+    </w:p>
+    <w:p>
+      <w:pPr>
+        <w:shd w:val="clear" w:color="auto" w:fill="F2F2F6"/>
+        <w:ind w:left="200"/>
+      </w:pPr>
+      <w:r>
+        <w:rPr>
+          <w:rFonts w:ascii="Consolas" w:eastAsia="Consolas" w:hAnsi="Consolas" w:cs="Consolas"/>
+          <w:sz w:val="18"/>
+          <w:szCs w:val="18"/>
+        </w:rPr>
+        <w:t>{ ...mostrar hex.Message... }</w:t>
+      </w:r>
+    </w:p>
+    <w:p>
+      <w:pPr>
+        <w:shd w:val="clear" w:color="auto" w:fill="F2F2F6"/>
+        <w:ind w:left="200"/>
+      </w:pPr>
+      <w:r>
+        <w:rPr>
+          <w:rFonts w:ascii="Consolas" w:eastAsia="Consolas" w:hAnsi="Consolas" w:cs="Consolas"/>
+          <w:sz w:val="18"/>
+          <w:szCs w:val="18"/>
+        </w:rPr>
+        <w:t>catch                           // cualquier otra cosa: error inesperado</w:t>
+      </w:r>
+    </w:p>
+    <w:p>
+      <w:pPr>
+        <w:shd w:val="clear" w:color="auto" w:fill="F2F2F6"/>
+        <w:spacing w:after="160"/>
+        <w:ind w:left="200"/>
+      </w:pPr>
+      <w:r>
+        <w:rPr>
+          <w:rFonts w:ascii="Consolas" w:eastAsia="Consolas" w:hAnsi="Consolas" w:cs="Consolas"/>
+          <w:sz w:val="18"/>
+          <w:szCs w:val="18"/>
+        </w:rPr>
+        <w:t>{ ...mensaje fijo, sin detalles internos... }</w:t>
+      </w:r>
+    </w:p>
+    <w:p>
+      <w:pPr>
+        <w:spacing w:after="140"/>
+      </w:pPr>
+      <w:r>
+        <w:t xml:space="preserve">El orden importa: C# prueba los </w:t>
+      </w:r>
+      <w:r>
+        <w:rPr>
+          <w:rFonts w:ascii="Consolas" w:eastAsia="Consolas" w:hAnsi="Consolas" w:cs="Consolas"/>
+          <w:sz w:val="19"/>
+          <w:szCs w:val="19"/>
+          <w:shd w:val="clear" w:color="auto" w:fill="EEEEF3"/>
+        </w:rPr>
+        <w:t>catch</w:t>
+      </w:r>
+      <w:r>
+        <w:t xml:space="preserve"> de arriba hacia abajo. Si el genérico estuviera primero, atraparía todo y el específico nunca se usaría (de hecho, el compilador da error).</w:t>
+      </w:r>
+    </w:p>
+    <w:p>
+      <w:pPr>
+        <w:spacing w:after="140"/>
+      </w:pPr>
+      <w:r>
+        <w:rPr>
+          <w:b/>
+          <w:bCs/>
+        </w:rPr>
+        <w:t>En cada capa de presentación:</w:t>
+      </w:r>
+    </w:p>
+    <w:tbl>
+      <w:tblPr>
+        <w:tblW w:w="9638" w:type="dxa"/>
+        <w:tblBorders>
+          <w:top w:val="single" w:sz="4" w:space="0" w:color="auto"/>
+          <w:left w:val="single" w:sz="4" w:space="0" w:color="auto"/>
+          <w:bottom w:val="single" w:sz="4" w:space="0" w:color="auto"/>
+          <w:right w:val="single" w:sz="4" w:space="0" w:color="auto"/>
+          <w:insideH w:val="single" w:sz="4" w:space="0" w:color="auto"/>
+          <w:insideV w:val="single" w:sz="4" w:space="0" w:color="auto"/>
+        </w:tblBorders>
+        <w:tblLayout w:type="fixed"/>
+        <w:tblLook w:val="04A0" w:firstRow="1" w:lastRow="0" w:firstColumn="1" w:lastColumn="0" w:noHBand="0" w:noVBand="1"/>
+      </w:tblPr>
+      <w:tblGrid>
+        <w:gridCol w:w="2753"/>
+        <w:gridCol w:w="3442"/>
+        <w:gridCol w:w="3443"/>
+      </w:tblGrid>
+      <w:tr>
+        <w:trPr>
+          <w:tblHeader/>
+        </w:trPr>
+        <w:tc>
+          <w:tcPr>
+            <w:tcW w:w="2753" w:type="dxa"/>
+            <w:tcBorders>
+              <w:top w:val="single" w:sz="4" w:space="0" w:color="BFBFCF"/>
+              <w:left w:val="single" w:sz="4" w:space="0" w:color="BFBFCF"/>
+              <w:bottom w:val="single" w:sz="4" w:space="0" w:color="BFBFCF"/>
+              <w:right w:val="single" w:sz="4" w:space="0" w:color="BFBFCF"/>
+            </w:tcBorders>
+            <w:shd w:val="clear" w:color="auto" w:fill="324A5F"/>
+            <w:tcMar>
+              <w:top w:w="60" w:type="dxa"/>
+              <w:left w:w="100" w:type="dxa"/>
+              <w:bottom w:w="60" w:type="dxa"/>
+              <w:right w:w="100" w:type="dxa"/>
+            </w:tcMar>
+          </w:tcPr>
+          <w:p>
+            <w:r>
+              <w:rPr>
+                <w:b/>
+                <w:bCs/>
+                <w:color w:val="FFFFFF"/>
+                <w:sz w:val="19"/>
+                <w:szCs w:val="19"/>
+              </w:rPr>
+              <w:t>Dónde</w:t>
+            </w:r>
+          </w:p>
+        </w:tc>
+        <w:tc>
+          <w:tcPr>
+            <w:tcW w:w="3442" w:type="dxa"/>
+            <w:tcBorders>
+              <w:top w:val="single" w:sz="4" w:space="0" w:color="BFBFCF"/>
+              <w:left w:val="single" w:sz="4" w:space="0" w:color="BFBFCF"/>
+              <w:bottom w:val="single" w:sz="4" w:space="0" w:color="BFBFCF"/>
+              <w:right w:val="single" w:sz="4" w:space="0" w:color="BFBFCF"/>
+            </w:tcBorders>
+            <w:shd w:val="clear" w:color="auto" w:fill="324A5F"/>
+            <w:tcMar>
+              <w:top w:w="60" w:type="dxa"/>
+              <w:left w:w="100" w:type="dxa"/>
+              <w:bottom w:w="60" w:type="dxa"/>
+              <w:right w:w="100" w:type="dxa"/>
+            </w:tcMar>
+          </w:tcPr>
+          <w:p>
+            <w:r>
+              <w:rPr>
+                <w:b/>
+                <w:bCs/>
+                <w:color w:val="FFFFFF"/>
+                <w:sz w:val="19"/>
+                <w:szCs w:val="19"/>
+              </w:rPr>
+              <w:t>Error esperado (</w:t>
+            </w:r>
+            <w:r>
+              <w:rPr>
+                <w:rFonts w:ascii="Consolas" w:eastAsia="Consolas" w:hAnsi="Consolas" w:cs="Consolas"/>
+                <w:b/>
+                <w:bCs/>
+                <w:color w:val="FFFFFF"/>
+                <w:sz w:val="19"/>
+                <w:szCs w:val="19"/>
+              </w:rPr>
+              <w:t>XException</w:t>
+            </w:r>
+            <w:r>
+              <w:rPr>
+                <w:b/>
+                <w:bCs/>
+                <w:color w:val="FFFFFF"/>
+                <w:sz w:val="19"/>
+                <w:szCs w:val="19"/>
+              </w:rPr>
+              <w:t>)</w:t>
+            </w:r>
+          </w:p>
+        </w:tc>
+        <w:tc>
+          <w:tcPr>
+            <w:tcW w:w="3443" w:type="dxa"/>
+            <w:tcBorders>
+              <w:top w:val="single" w:sz="4" w:space="0" w:color="BFBFCF"/>
+              <w:left w:val="single" w:sz="4" w:space="0" w:color="BFBFCF"/>
+              <w:bottom w:val="single" w:sz="4" w:space="0" w:color="BFBFCF"/>
+              <w:right w:val="single" w:sz="4" w:space="0" w:color="BFBFCF"/>
+            </w:tcBorders>
+            <w:shd w:val="clear" w:color="auto" w:fill="324A5F"/>
+            <w:tcMar>
+              <w:top w:w="60" w:type="dxa"/>
+              <w:left w:w="100" w:type="dxa"/>
+              <w:bottom w:w="60" w:type="dxa"/>
+              <w:right w:w="100" w:type="dxa"/>
+            </w:tcMar>
+          </w:tcPr>
+          <w:p>
+            <w:r>
+              <w:rPr>
+                <w:b/>
+                <w:bCs/>
+                <w:color w:val="FFFFFF"/>
+                <w:sz w:val="19"/>
+                <w:szCs w:val="19"/>
+              </w:rPr>
+              <w:t>Error inesperado (</w:t>
+            </w:r>
+            <w:r>
+              <w:rPr>
+                <w:rFonts w:ascii="Consolas" w:eastAsia="Consolas" w:hAnsi="Consolas" w:cs="Consolas"/>
+                <w:b/>
+                <w:bCs/>
+                <w:color w:val="FFFFFF"/>
+                <w:sz w:val="19"/>
+                <w:szCs w:val="19"/>
+              </w:rPr>
+              <w:t>catch</w:t>
+            </w:r>
+            <w:r>
+              <w:rPr>
+                <w:b/>
+                <w:bCs/>
+                <w:color w:val="FFFFFF"/>
+                <w:sz w:val="19"/>
+                <w:szCs w:val="19"/>
+              </w:rPr>
+              <w:t xml:space="preserve"> genérico)</w:t>
+            </w:r>
+          </w:p>
+        </w:tc>
+      </w:tr>
+      <w:tr>
+        <w:tc>
+          <w:tcPr>
+            <w:tcW w:w="2753" w:type="dxa"/>
+            <w:tcBorders>
+              <w:top w:val="single" w:sz="4" w:space="0" w:color="BFBFCF"/>
+              <w:left w:val="single" w:sz="4" w:space="0" w:color="BFBFCF"/>
+              <w:bottom w:val="single" w:sz="4" w:space="0" w:color="BFBFCF"/>
+              <w:right w:val="single" w:sz="4" w:space="0" w:color="BFBFCF"/>
+            </w:tcBorders>
+            <w:tcMar>
+              <w:top w:w="60" w:type="dxa"/>
+              <w:left w:w="100" w:type="dxa"/>
+              <w:bottom w:w="60" w:type="dxa"/>
+              <w:right w:w="100" w:type="dxa"/>
+            </w:tcMar>
+          </w:tcPr>
+          <w:p>
+            <w:r>
+              <w:rPr>
+                <w:b/>
+                <w:bCs/>
+                <w:sz w:val="19"/>
+                <w:szCs w:val="19"/>
+              </w:rPr>
+              <w:t>Admin (MVC)</w:t>
+            </w:r>
+            <w:r>
+              <w:rPr>
+                <w:sz w:val="19"/>
+                <w:szCs w:val="19"/>
+              </w:rPr>
+              <w:t>, formularios POST</w:t>
+            </w:r>
+          </w:p>
+        </w:tc>
+        <w:tc>
+          <w:tcPr>
+            <w:tcW w:w="3442" w:type="dxa"/>
+            <w:tcBorders>
+              <w:top w:val="single" w:sz="4" w:space="0" w:color="BFBFCF"/>
+              <w:left w:val="single" w:sz="4" w:space="0" w:color="BFBFCF"/>
+              <w:bottom w:val="single" w:sz="4" w:space="0" w:color="BFBFCF"/>
+              <w:right w:val="single" w:sz="4" w:space="0" w:color="BFBFCF"/>
+            </w:tcBorders>
+            <w:tcMar>
+              <w:top w:w="60" w:type="dxa"/>
+              <w:left w:w="100" w:type="dxa"/>
+              <w:bottom w:w="60" w:type="dxa"/>
+              <w:right w:w="100" w:type="dxa"/>
+            </w:tcMar>
+          </w:tcPr>
+          <w:p>
+            <w:r>
+              <w:rPr>
+                <w:rFonts w:ascii="Consolas" w:eastAsia="Consolas" w:hAnsi="Consolas" w:cs="Consolas"/>
+                <w:sz w:val="19"/>
+                <w:szCs w:val="19"/>
+                <w:shd w:val="clear" w:color="auto" w:fill="EEEEF3"/>
+              </w:rPr>
+              <w:t>ModelState.AddModelError(string.Empty, ex.Message)</w:t>
+            </w:r>
+            <w:r>
+              <w:rPr>
+                <w:sz w:val="19"/>
+                <w:szCs w:val="19"/>
+              </w:rPr>
+              <w:t xml:space="preserve"> → se ve arriba del formulario</w:t>
+            </w:r>
+          </w:p>
+        </w:tc>
+        <w:tc>
+          <w:tcPr>
+            <w:tcW w:w="3443" w:type="dxa"/>
+            <w:tcBorders>
+              <w:top w:val="single" w:sz="4" w:space="0" w:color="BFBFCF"/>
+              <w:left w:val="single" w:sz="4" w:space="0" w:color="BFBFCF"/>
+              <w:bottom w:val="single" w:sz="4" w:space="0" w:color="BFBFCF"/>
+              <w:right w:val="single" w:sz="4" w:space="0" w:color="BFBFCF"/>
+            </w:tcBorders>
+            <w:tcMar>
+              <w:top w:w="60" w:type="dxa"/>
+              <w:left w:w="100" w:type="dxa"/>
+              <w:bottom w:w="60" w:type="dxa"/>
+              <w:right w:w="100" w:type="dxa"/>
+            </w:tcMar>
+          </w:tcPr>
+          <w:p>
+            <w:r>
+              <w:rPr>
+                <w:sz w:val="19"/>
+                <w:szCs w:val="19"/>
+              </w:rPr>
+              <w:t>Mensaje fijo: "Error inesperado al crear la historia, vuelva a intentar."</w:t>
+            </w:r>
+          </w:p>
+        </w:tc>
+      </w:tr>
+      <w:tr>
+        <w:tc>
+          <w:tcPr>
+            <w:tcW w:w="2753" w:type="dxa"/>
+            <w:tcBorders>
+              <w:top w:val="single" w:sz="4" w:space="0" w:color="BFBFCF"/>
+              <w:left w:val="single" w:sz="4" w:space="0" w:color="BFBFCF"/>
+              <w:bottom w:val="single" w:sz="4" w:space="0" w:color="BFBFCF"/>
+              <w:right w:val="single" w:sz="4" w:space="0" w:color="BFBFCF"/>
+            </w:tcBorders>
+            <w:tcMar>
+              <w:top w:w="60" w:type="dxa"/>
+              <w:left w:w="100" w:type="dxa"/>
+              <w:bottom w:w="60" w:type="dxa"/>
+              <w:right w:w="100" w:type="dxa"/>
+            </w:tcMar>
+          </w:tcPr>
+          <w:p>
+            <w:r>
+              <w:rPr>
+                <w:b/>
+                <w:bCs/>
+                <w:sz w:val="19"/>
+                <w:szCs w:val="19"/>
+              </w:rPr>
+              <w:t>Admin (MVC)</w:t>
+            </w:r>
+            <w:r>
+              <w:rPr>
+                <w:sz w:val="19"/>
+                <w:szCs w:val="19"/>
+              </w:rPr>
+              <w:t>, pantallas con Id (Details/Edit)</w:t>
+            </w:r>
+          </w:p>
+        </w:tc>
+        <w:tc>
+          <w:tcPr>
+            <w:tcW w:w="3442" w:type="dxa"/>
+            <w:tcBorders>
+              <w:top w:val="single" w:sz="4" w:space="0" w:color="BFBFCF"/>
+              <w:left w:val="single" w:sz="4" w:space="0" w:color="BFBFCF"/>
+              <w:bottom w:val="single" w:sz="4" w:space="0" w:color="BFBFCF"/>
+              <w:right w:val="single" w:sz="4" w:space="0" w:color="BFBFCF"/>
+            </w:tcBorders>
+            <w:tcMar>
+              <w:top w:w="60" w:type="dxa"/>
+              <w:left w:w="100" w:type="dxa"/>
+              <w:bottom w:w="60" w:type="dxa"/>
+              <w:right w:w="100" w:type="dxa"/>
+            </w:tcMar>
+          </w:tcPr>
+          <w:p>
+            <w:r>
+              <w:rPr>
+                <w:sz w:val="19"/>
+                <w:szCs w:val="19"/>
+              </w:rPr>
+              <w:t xml:space="preserve">Redirige al listado con </w:t>
+            </w:r>
+            <w:r>
+              <w:rPr>
+                <w:rFonts w:ascii="Consolas" w:eastAsia="Consolas" w:hAnsi="Consolas" w:cs="Consolas"/>
+                <w:sz w:val="19"/>
+                <w:szCs w:val="19"/>
+                <w:shd w:val="clear" w:color="auto" w:fill="EEEEF3"/>
+              </w:rPr>
+              <w:t>TempData["Error"] = ex.Message</w:t>
+            </w:r>
+          </w:p>
+        </w:tc>
+        <w:tc>
+          <w:tcPr>
+            <w:tcW w:w="3443" w:type="dxa"/>
+            <w:tcBorders>
+              <w:top w:val="single" w:sz="4" w:space="0" w:color="BFBFCF"/>
+              <w:left w:val="single" w:sz="4" w:space="0" w:color="BFBFCF"/>
+              <w:bottom w:val="single" w:sz="4" w:space="0" w:color="BFBFCF"/>
+              <w:right w:val="single" w:sz="4" w:space="0" w:color="BFBFCF"/>
+            </w:tcBorders>
+            <w:tcMar>
+              <w:top w:w="60" w:type="dxa"/>
+              <w:left w:w="100" w:type="dxa"/>
+              <w:bottom w:w="60" w:type="dxa"/>
+              <w:right w:w="100" w:type="dxa"/>
+            </w:tcMar>
+          </w:tcPr>
+          <w:p>
+            <w:r>
+              <w:rPr>
+                <w:sz w:val="19"/>
+                <w:szCs w:val="19"/>
+              </w:rPr>
+              <w:t>Igual, con mensaje fijo</w:t>
+            </w:r>
+          </w:p>
+        </w:tc>
+      </w:tr>
+      <w:tr>
+        <w:tc>
+          <w:tcPr>
+            <w:tcW w:w="2753" w:type="dxa"/>
+            <w:tcBorders>
+              <w:top w:val="single" w:sz="4" w:space="0" w:color="BFBFCF"/>
+              <w:left w:val="single" w:sz="4" w:space="0" w:color="BFBFCF"/>
+              <w:bottom w:val="single" w:sz="4" w:space="0" w:color="BFBFCF"/>
+              <w:right w:val="single" w:sz="4" w:space="0" w:color="BFBFCF"/>
+            </w:tcBorders>
+            <w:tcMar>
+              <w:top w:w="60" w:type="dxa"/>
+              <w:left w:w="100" w:type="dxa"/>
+              <w:bottom w:w="60" w:type="dxa"/>
+              <w:right w:w="100" w:type="dxa"/>
+            </w:tcMar>
+          </w:tcPr>
+          <w:p>
+            <w:r>
+              <w:rPr>
+                <w:b/>
+                <w:bCs/>
+                <w:sz w:val="19"/>
+                <w:szCs w:val="19"/>
+              </w:rPr>
+              <w:t>Web API</w:t>
+            </w:r>
+          </w:p>
+        </w:tc>
+        <w:tc>
+          <w:tcPr>
+            <w:tcW w:w="3442" w:type="dxa"/>
+            <w:tcBorders>
+              <w:top w:val="single" w:sz="4" w:space="0" w:color="BFBFCF"/>
+              <w:left w:val="single" w:sz="4" w:space="0" w:color="BFBFCF"/>
+              <w:bottom w:val="single" w:sz="4" w:space="0" w:color="BFBFCF"/>
+              <w:right w:val="single" w:sz="4" w:space="0" w:color="BFBFCF"/>
+            </w:tcBorders>
+            <w:tcMar>
+              <w:top w:w="60" w:type="dxa"/>
+              <w:left w:w="100" w:type="dxa"/>
+              <w:bottom w:w="60" w:type="dxa"/>
+              <w:right w:w="100" w:type="dxa"/>
+            </w:tcMar>
+          </w:tcPr>
+          <w:p>
+            <w:r>
+              <w:rPr>
+                <w:rFonts w:ascii="Consolas" w:eastAsia="Consolas" w:hAnsi="Consolas" w:cs="Consolas"/>
+                <w:sz w:val="19"/>
+                <w:szCs w:val="19"/>
+                <w:shd w:val="clear" w:color="auto" w:fill="EEEEF3"/>
+              </w:rPr>
+              <w:t>NotFound(ex.Message)</w:t>
+            </w:r>
+            <w:r>
+              <w:rPr>
+                <w:sz w:val="19"/>
+                <w:szCs w:val="19"/>
+              </w:rPr>
+              <w:t xml:space="preserve"> si "no existe" (404), </w:t>
+            </w:r>
+            <w:r>
+              <w:rPr>
+                <w:rFonts w:ascii="Consolas" w:eastAsia="Consolas" w:hAnsi="Consolas" w:cs="Consolas"/>
+                <w:sz w:val="19"/>
+                <w:szCs w:val="19"/>
+                <w:shd w:val="clear" w:color="auto" w:fill="EEEEF3"/>
+              </w:rPr>
+              <w:t>BadRequest(ex.Message)</w:t>
+            </w:r>
+            <w:r>
+              <w:rPr>
+                <w:sz w:val="19"/>
+                <w:szCs w:val="19"/>
+              </w:rPr>
+              <w:t xml:space="preserve"> si es una regla (400)</w:t>
+            </w:r>
+          </w:p>
+        </w:tc>
+        <w:tc>
+          <w:tcPr>
+            <w:tcW w:w="3443" w:type="dxa"/>
+            <w:tcBorders>
+              <w:top w:val="single" w:sz="4" w:space="0" w:color="BFBFCF"/>
+              <w:left w:val="single" w:sz="4" w:space="0" w:color="BFBFCF"/>
+              <w:bottom w:val="single" w:sz="4" w:space="0" w:color="BFBFCF"/>
+              <w:right w:val="single" w:sz="4" w:space="0" w:color="BFBFCF"/>
+            </w:tcBorders>
+            <w:tcMar>
+              <w:top w:w="60" w:type="dxa"/>
+              <w:left w:w="100" w:type="dxa"/>
+              <w:bottom w:w="60" w:type="dxa"/>
+              <w:right w:w="100" w:type="dxa"/>
+            </w:tcMar>
+          </w:tcPr>
+          <w:p>
+            <w:r>
+              <w:rPr>
+                <w:rFonts w:ascii="Consolas" w:eastAsia="Consolas" w:hAnsi="Consolas" w:cs="Consolas"/>
+                <w:sz w:val="19"/>
+                <w:szCs w:val="19"/>
+                <w:shd w:val="clear" w:color="auto" w:fill="EEEEF3"/>
+              </w:rPr>
+              <w:t>StatusCode(500, "Error inesperado, vuelva a intentar más tarde.")</w:t>
+            </w:r>
+          </w:p>
+        </w:tc>
+      </w:tr>
+      <w:tr>
+        <w:tc>
+          <w:tcPr>
+            <w:tcW w:w="2753" w:type="dxa"/>
+            <w:tcBorders>
+              <w:top w:val="single" w:sz="4" w:space="0" w:color="BFBFCF"/>
+              <w:left w:val="single" w:sz="4" w:space="0" w:color="BFBFCF"/>
+              <w:bottom w:val="single" w:sz="4" w:space="0" w:color="BFBFCF"/>
+              <w:right w:val="single" w:sz="4" w:space="0" w:color="BFBFCF"/>
+            </w:tcBorders>
+            <w:tcMar>
+              <w:top w:w="60" w:type="dxa"/>
+              <w:left w:w="100" w:type="dxa"/>
+              <w:bottom w:w="60" w:type="dxa"/>
+              <w:right w:w="100" w:type="dxa"/>
+            </w:tcMar>
+          </w:tcPr>
+          <w:p>
+            <w:r>
+              <w:rPr>
+                <w:b/>
+                <w:bCs/>
+                <w:sz w:val="19"/>
+                <w:szCs w:val="19"/>
+              </w:rPr>
+              <w:t>Cliente MVC</w:t>
+            </w:r>
+          </w:p>
+        </w:tc>
+        <w:tc>
+          <w:tcPr>
+            <w:tcW w:w="3442" w:type="dxa"/>
+            <w:tcBorders>
+              <w:top w:val="single" w:sz="4" w:space="0" w:color="BFBFCF"/>
+              <w:left w:val="single" w:sz="4" w:space="0" w:color="BFBFCF"/>
+              <w:bottom w:val="single" w:sz="4" w:space="0" w:color="BFBFCF"/>
+              <w:right w:val="single" w:sz="4" w:space="0" w:color="BFBFCF"/>
+            </w:tcBorders>
+            <w:tcMar>
+              <w:top w:w="60" w:type="dxa"/>
+              <w:left w:w="100" w:type="dxa"/>
+              <w:bottom w:w="60" w:type="dxa"/>
+              <w:right w:w="100" w:type="dxa"/>
+            </w:tcMar>
+          </w:tcPr>
+          <w:p>
+            <w:r>
+              <w:rPr>
+                <w:sz w:val="19"/>
+                <w:szCs w:val="19"/>
+              </w:rPr>
+              <w:t xml:space="preserve">Si la API no da </w:t>
+            </w:r>
+            <w:r>
+              <w:rPr>
+                <w:rFonts w:ascii="Consolas" w:eastAsia="Consolas" w:hAnsi="Consolas" w:cs="Consolas"/>
+                <w:sz w:val="19"/>
+                <w:szCs w:val="19"/>
+                <w:shd w:val="clear" w:color="auto" w:fill="EEEEF3"/>
+              </w:rPr>
+              <w:t>IsSuccessStatusCode</w:t>
+            </w:r>
+            <w:r>
+              <w:rPr>
+                <w:sz w:val="19"/>
+                <w:szCs w:val="19"/>
+              </w:rPr>
+              <w:t>, se muestra el texto que devolvió la API</w:t>
+            </w:r>
+          </w:p>
+        </w:tc>
+        <w:tc>
+          <w:tcPr>
+            <w:tcW w:w="3443" w:type="dxa"/>
+            <w:tcBorders>
+              <w:top w:val="single" w:sz="4" w:space="0" w:color="BFBFCF"/>
+              <w:left w:val="single" w:sz="4" w:space="0" w:color="BFBFCF"/>
+              <w:bottom w:val="single" w:sz="4" w:space="0" w:color="BFBFCF"/>
+              <w:right w:val="single" w:sz="4" w:space="0" w:color="BFBFCF"/>
+            </w:tcBorders>
+            <w:tcMar>
+              <w:top w:w="60" w:type="dxa"/>
+              <w:left w:w="100" w:type="dxa"/>
+              <w:bottom w:w="60" w:type="dxa"/>
+              <w:right w:w="100" w:type="dxa"/>
+            </w:tcMar>
+          </w:tcPr>
+          <w:p>
+            <w:r>
+              <w:rPr>
+                <w:sz w:val="19"/>
+                <w:szCs w:val="19"/>
+              </w:rPr>
+              <w:t>"No se pudo conectar con el servidor..." (la API está caída)</w:t>
+            </w:r>
+          </w:p>
+        </w:tc>
+      </w:tr>
+    </w:tbl>
+    <w:p>
+      <w:pPr>
+        <w:spacing w:after="120"/>
+      </w:pPr>
+    </w:p>
+    <w:p>
+      <w:pPr>
+        <w:spacing w:after="140"/>
+      </w:pPr>
+      <w:r>
+        <w:rPr>
+          <w:b/>
+          <w:bCs/>
+        </w:rPr>
+        <w:t>Detalles que pueden preguntar:</w:t>
+      </w:r>
+    </w:p>
+    <w:p>
+      <w:pPr>
+        <w:pStyle w:val="Prrafodelista"/>
+        <w:numPr>
+          <w:ilvl w:val="0"/>
+          <w:numId w:val="3"/>
+        </w:numPr>
+        <w:spacing w:after="60"/>
+      </w:pPr>
+      <w:r>
+        <w:rPr>
+          <w:b/>
+          <w:bCs/>
+        </w:rPr>
+        <w:t xml:space="preserve">¿Por qué el 500 no devuelve </w:t>
+      </w:r>
+      <w:r>
+        <w:rPr>
+          <w:rFonts w:ascii="Consolas" w:eastAsia="Consolas" w:hAnsi="Consolas" w:cs="Consolas"/>
+          <w:b/>
+          <w:bCs/>
+          <w:sz w:val="19"/>
+          <w:szCs w:val="19"/>
+          <w:shd w:val="clear" w:color="auto" w:fill="EEEEF3"/>
+        </w:rPr>
+        <w:t>ex.Message</w:t>
+      </w:r>
+      <w:r>
+        <w:rPr>
+          <w:b/>
+          <w:bCs/>
+        </w:rPr>
+        <w:t>?</w:t>
+      </w:r>
+      <w:r>
+        <w:t xml:space="preserve"> Porque un error inesperado puede traer detalles internos (nombres de tablas, la cadena de conexión...) que el cliente no tiene por qué ver. Al usuario se le da un mensaje genérico.</w:t>
+      </w:r>
+    </w:p>
+    <w:p>
+      <w:pPr>
+        <w:pStyle w:val="Prrafodelista"/>
+        <w:numPr>
+          <w:ilvl w:val="0"/>
+          <w:numId w:val="3"/>
+        </w:numPr>
+        <w:spacing w:after="60"/>
+      </w:pPr>
+      <w:r>
+        <w:rPr>
+          <w:b/>
+          <w:bCs/>
+        </w:rPr>
+        <w:t>¿Por qué 404 y no 400 en "no encontrado"?</w:t>
+      </w:r>
+      <w:r>
+        <w:t xml:space="preserve"> El profe usa 400 en </w:t>
+      </w:r>
+      <w:r>
+        <w:rPr>
+          <w:rFonts w:ascii="Consolas" w:eastAsia="Consolas" w:hAnsi="Consolas" w:cs="Consolas"/>
+          <w:sz w:val="19"/>
+          <w:szCs w:val="19"/>
+          <w:shd w:val="clear" w:color="auto" w:fill="EEEEF3"/>
+        </w:rPr>
+        <w:t>api/Usuario/{id}</w:t>
+      </w:r>
+      <w:r>
+        <w:t>, pero el enunciado pide "códigos de estado adecuados según la guía REST": si el recurso pedido en la URL no existe, es 404.</w:t>
+      </w:r>
+    </w:p>
+    <w:p>
+      <w:pPr>
+        <w:pStyle w:val="Prrafodelista"/>
+        <w:numPr>
+          <w:ilvl w:val="0"/>
+          <w:numId w:val="3"/>
+        </w:numPr>
+        <w:spacing w:after="60"/>
+      </w:pPr>
+      <w:r>
+        <w:rPr>
+          <w:rFonts w:ascii="Consolas" w:eastAsia="Consolas" w:hAnsi="Consolas" w:cs="Consolas"/>
+          <w:b/>
+          <w:bCs/>
+          <w:sz w:val="19"/>
+          <w:szCs w:val="19"/>
+          <w:shd w:val="clear" w:color="auto" w:fill="EEEEF3"/>
+        </w:rPr>
+        <w:t>TempData</w:t>
+      </w:r>
+      <w:r>
+        <w:rPr>
+          <w:b/>
+          <w:bCs/>
+        </w:rPr>
+        <w:t xml:space="preserve"> vs </w:t>
+      </w:r>
+      <w:r>
+        <w:rPr>
+          <w:rFonts w:ascii="Consolas" w:eastAsia="Consolas" w:hAnsi="Consolas" w:cs="Consolas"/>
+          <w:b/>
+          <w:bCs/>
+          <w:sz w:val="19"/>
+          <w:szCs w:val="19"/>
+          <w:shd w:val="clear" w:color="auto" w:fill="EEEEF3"/>
+        </w:rPr>
+        <w:t>ViewBag</w:t>
+      </w:r>
+      <w:r>
+        <w:t xml:space="preserve">: </w:t>
+      </w:r>
+      <w:r>
+        <w:rPr>
+          <w:rFonts w:ascii="Consolas" w:eastAsia="Consolas" w:hAnsi="Consolas" w:cs="Consolas"/>
+          <w:sz w:val="19"/>
+          <w:szCs w:val="19"/>
+          <w:shd w:val="clear" w:color="auto" w:fill="EEEEF3"/>
+        </w:rPr>
+        <w:t>ViewBag</w:t>
+      </w:r>
+      <w:r>
+        <w:t xml:space="preserve"> dura </w:t>
+      </w:r>
+      <w:r>
+        <w:rPr>
+          <w:b/>
+          <w:bCs/>
+        </w:rPr>
+        <w:t>un solo pedido</w:t>
+      </w:r>
+      <w:r>
+        <w:t xml:space="preserve">. </w:t>
+      </w:r>
+      <w:r>
+        <w:rPr>
+          <w:rFonts w:ascii="Consolas" w:eastAsia="Consolas" w:hAnsi="Consolas" w:cs="Consolas"/>
+          <w:sz w:val="19"/>
+          <w:szCs w:val="19"/>
+          <w:shd w:val="clear" w:color="auto" w:fill="EEEEF3"/>
+        </w:rPr>
+        <w:t>TempData</w:t>
+      </w:r>
+      <w:r>
+        <w:t xml:space="preserve"> sobrevive a </w:t>
+      </w:r>
+      <w:r>
+        <w:rPr>
+          <w:b/>
+          <w:bCs/>
+        </w:rPr>
+        <w:t>un redirect</w:t>
+      </w:r>
+      <w:r>
+        <w:t xml:space="preserve"> (se guarda en una cookie hasta que se lee). Por eso, cuando se redirige al listado con un error, se usa </w:t>
+      </w:r>
+      <w:r>
+        <w:rPr>
+          <w:rFonts w:ascii="Consolas" w:eastAsia="Consolas" w:hAnsi="Consolas" w:cs="Consolas"/>
+          <w:sz w:val="19"/>
+          <w:szCs w:val="19"/>
+          <w:shd w:val="clear" w:color="auto" w:fill="EEEEF3"/>
+        </w:rPr>
+        <w:t>TempData</w:t>
+      </w:r>
+      <w:r>
+        <w:t xml:space="preserve">, y cuando se muestra la vista en el mismo pedido, alcanza con </w:t>
+      </w:r>
+      <w:r>
+        <w:rPr>
+          <w:rFonts w:ascii="Consolas" w:eastAsia="Consolas" w:hAnsi="Consolas" w:cs="Consolas"/>
+          <w:sz w:val="19"/>
+          <w:szCs w:val="19"/>
+          <w:shd w:val="clear" w:color="auto" w:fill="EEEEF3"/>
+        </w:rPr>
+        <w:t>ViewBag</w:t>
+      </w:r>
+      <w:r>
+        <w:t>.</w:t>
+      </w:r>
+    </w:p>
+    <w:p>
+      <w:pPr>
+        <w:pStyle w:val="Prrafodelista"/>
+        <w:numPr>
+          <w:ilvl w:val="0"/>
+          <w:numId w:val="3"/>
+        </w:numPr>
+        <w:spacing w:after="60"/>
+      </w:pPr>
+      <w:r>
+        <w:rPr>
+          <w:b/>
+          <w:bCs/>
+        </w:rPr>
+        <w:t xml:space="preserve">Los dos </w:t>
+      </w:r>
+      <w:r>
+        <w:rPr>
+          <w:rFonts w:ascii="Consolas" w:eastAsia="Consolas" w:hAnsi="Consolas" w:cs="Consolas"/>
+          <w:b/>
+          <w:bCs/>
+          <w:sz w:val="19"/>
+          <w:szCs w:val="19"/>
+          <w:shd w:val="clear" w:color="auto" w:fill="EEEEF3"/>
+        </w:rPr>
+        <w:t>_Layout</w:t>
+      </w:r>
+      <w:r>
+        <w:t xml:space="preserve"> (Admin y Usuario) muestran el error arriba de cualquier pantalla, así no hay que repetir ese bloque en cada vista.</w:t>
+      </w:r>
+    </w:p>
+    <w:p>
+      <w:pPr>
+        <w:pStyle w:val="Prrafodelista"/>
+        <w:numPr>
+          <w:ilvl w:val="0"/>
+          <w:numId w:val="3"/>
+        </w:numPr>
+        <w:spacing w:after="60"/>
+      </w:pPr>
+      <w:r>
+        <w:rPr>
+          <w:b/>
+          <w:bCs/>
+        </w:rPr>
+        <w:t>Un POST que falla vuelve a mostrar el formulario reusando la acción GET</w:t>
+      </w:r>
+      <w:r>
+        <w:t xml:space="preserve"> (</w:t>
+      </w:r>
+      <w:r>
+        <w:rPr>
+          <w:rFonts w:ascii="Consolas" w:eastAsia="Consolas" w:hAnsi="Consolas" w:cs="Consolas"/>
+          <w:sz w:val="19"/>
+          <w:szCs w:val="19"/>
+          <w:shd w:val="clear" w:color="auto" w:fill="EEEEF3"/>
+        </w:rPr>
+        <w:t>return Edit(id);</w:t>
+      </w:r>
+      <w:r>
+        <w:t xml:space="preserve">). Antes, el </w:t>
+      </w:r>
+      <w:r>
+        <w:rPr>
+          <w:rFonts w:ascii="Consolas" w:eastAsia="Consolas" w:hAnsi="Consolas" w:cs="Consolas"/>
+          <w:sz w:val="19"/>
+          <w:szCs w:val="19"/>
+          <w:shd w:val="clear" w:color="auto" w:fill="EEEEF3"/>
+        </w:rPr>
+        <w:t>catch</w:t>
+      </w:r>
+      <w:r>
+        <w:t xml:space="preserve"> volvía a buscar la historia por su cuenta, y si esa búsqueda también fallaba, el error explotaba </w:t>
+      </w:r>
+      <w:r>
+        <w:rPr>
+          <w:b/>
+          <w:bCs/>
+        </w:rPr>
+        <w:t>adentro del catch</w:t>
+      </w:r>
+      <w:r>
+        <w:t>, sin nadie que lo atrapara.</w:t>
+      </w:r>
+    </w:p>
+    <w:p>
+      <w:pPr>
+        <w:spacing w:after="140"/>
+      </w:pPr>
+      <w:r>
+        <w:rPr>
+          <w:b/>
+          <w:bCs/>
+        </w:rPr>
+        <w:t>Probado:</w:t>
+      </w:r>
+    </w:p>
+    <w:p>
+      <w:pPr>
+        <w:pStyle w:val="Prrafodelista"/>
+        <w:numPr>
+          <w:ilvl w:val="0"/>
+          <w:numId w:val="3"/>
+        </w:numPr>
+        <w:spacing w:after="60"/>
+      </w:pPr>
+      <w:r>
+        <w:t>Admin: Id inexistente en Historia/Usuario/Auditoría (Details/Edit/AgregarCapitulo) → vuelve al listado con "No se encontró...". Historia sin título → "El título de la historia es obligatorio." Login malo → "Usuario o contraseña incorrectos."</w:t>
+      </w:r>
+    </w:p>
+    <w:p>
+      <w:pPr>
+        <w:pStyle w:val="Prrafodelista"/>
+        <w:numPr>
+          <w:ilvl w:val="0"/>
+          <w:numId w:val="3"/>
+        </w:numPr>
+        <w:spacing w:after="60"/>
+      </w:pPr>
+      <w:r>
+        <w:t xml:space="preserve">API: </w:t>
+      </w:r>
+      <w:r>
+        <w:rPr>
+          <w:rFonts w:ascii="Consolas" w:eastAsia="Consolas" w:hAnsi="Consolas" w:cs="Consolas"/>
+          <w:sz w:val="19"/>
+          <w:szCs w:val="19"/>
+          <w:shd w:val="clear" w:color="auto" w:fill="EEEEF3"/>
+        </w:rPr>
+        <w:t>api/Historia/999</w:t>
+      </w:r>
+      <w:r>
+        <w:t xml:space="preserve">, </w:t>
+      </w:r>
+      <w:r>
+        <w:rPr>
+          <w:rFonts w:ascii="Consolas" w:eastAsia="Consolas" w:hAnsi="Consolas" w:cs="Consolas"/>
+          <w:sz w:val="19"/>
+          <w:szCs w:val="19"/>
+          <w:shd w:val="clear" w:color="auto" w:fill="EEEEF3"/>
+        </w:rPr>
+        <w:t>api/Lectura/999</w:t>
+      </w:r>
+      <w:r>
+        <w:t xml:space="preserve">, </w:t>
+      </w:r>
+      <w:r>
+        <w:rPr>
+          <w:rFonts w:ascii="Consolas" w:eastAsia="Consolas" w:hAnsi="Consolas" w:cs="Consolas"/>
+          <w:sz w:val="19"/>
+          <w:szCs w:val="19"/>
+          <w:shd w:val="clear" w:color="auto" w:fill="EEEEF3"/>
+        </w:rPr>
+        <w:t>api/Usuario/999</w:t>
+      </w:r>
+      <w:r>
+        <w:t xml:space="preserve">, </w:t>
+      </w:r>
+      <w:r>
+        <w:rPr>
+          <w:rFonts w:ascii="Consolas" w:eastAsia="Consolas" w:hAnsi="Consolas" w:cs="Consolas"/>
+          <w:sz w:val="19"/>
+          <w:szCs w:val="19"/>
+          <w:shd w:val="clear" w:color="auto" w:fill="EEEEF3"/>
+        </w:rPr>
+        <w:t>api/Estadistica/FinalesPorHistoria/999</w:t>
+      </w:r>
+      <w:r>
+        <w:t xml:space="preserve"> → 404 con mensaje; avanzar una lectura inexistente → 400; login malo → 400.</w:t>
+      </w:r>
+    </w:p>
+    <w:p>
+      <w:pPr>
+        <w:pStyle w:val="Prrafodelista"/>
+        <w:numPr>
+          <w:ilvl w:val="0"/>
+          <w:numId w:val="3"/>
+        </w:numPr>
+        <w:spacing w:after="60"/>
+      </w:pPr>
+      <w:r>
+        <w:rPr>
+          <w:b/>
+          <w:bCs/>
+        </w:rPr>
+        <w:t>Base de datos caída</w:t>
+      </w:r>
+      <w:r>
+        <w:t xml:space="preserve"> (se levantó la API apuntando a una base inexistente; ojo: </w:t>
+      </w:r>
+      <w:r>
+        <w:rPr>
+          <w:rFonts w:ascii="Consolas" w:eastAsia="Consolas" w:hAnsi="Consolas" w:cs="Consolas"/>
+          <w:sz w:val="19"/>
+          <w:szCs w:val="19"/>
+          <w:shd w:val="clear" w:color="auto" w:fill="EEEEF3"/>
+        </w:rPr>
+        <w:t>sqllocaldb stop</w:t>
+      </w:r>
+      <w:r>
+        <w:t xml:space="preserve"> no sirve para probar esto, porque LocalDB </w:t>
+      </w:r>
+      <w:r>
+        <w:rPr>
+          <w:b/>
+          <w:bCs/>
+        </w:rPr>
+        <w:t>se vuelve a prender solo</w:t>
+      </w:r>
+      <w:r>
+        <w:t xml:space="preserve"> cuando alguien se conecta): la API devuelve 500 "Error inesperado..." y el cliente muestra "No se pudo conectar con el servidor...".</w:t>
+      </w:r>
+    </w:p>
+    <w:p>
+      <w:pPr>
+        <w:pStyle w:val="Prrafodelista"/>
+        <w:numPr>
+          <w:ilvl w:val="0"/>
+          <w:numId w:val="3"/>
+        </w:numPr>
+        <w:spacing w:after="60"/>
+      </w:pPr>
+      <w:r>
+        <w:rPr>
+          <w:b/>
+          <w:bCs/>
+        </w:rPr>
+        <w:t>API apagada</w:t>
+      </w:r>
+      <w:r>
+        <w:t>: el login del cliente muestra "No se pudo conectar con el servidor...".</w:t>
+      </w:r>
+    </w:p>
+    <w:p>
+      <w:pPr>
+        <w:pStyle w:val="Ttulo1"/>
+        <w:pageBreakBefore/>
+      </w:pPr>
+      <w:bookmarkStart w:id="18" w:name="_Toc244253443"/>
+      <w:r>
+        <w:t>Investigación RF12 — Selección de estilo de lectura</w:t>
+      </w:r>
+      <w:bookmarkEnd w:id="18"/>
+    </w:p>
+    <w:p>
+      <w:pPr>
+        <w:spacing w:after="140"/>
+      </w:pPr>
+      <w:r>
+        <w:t xml:space="preserve">Base para el punto </w:t>
+      </w:r>
+      <w:r>
+        <w:rPr>
+          <w:b/>
+          <w:bCs/>
+        </w:rPr>
+        <w:t>C.h del informe</w:t>
+      </w:r>
+      <w:r>
+        <w:t xml:space="preserve"> ("Documentar la investigación realizada para implementar la selección de estilos"). El enunciado pide investigar el tema por cuenta propia, apoyándose en una herramienta de IA generativa, y documentar la investigación y cómo se decidió implementarlo. Esto es un borrador: pasarlo al informe con sus palabras.</w:t>
+      </w:r>
+    </w:p>
+    <w:p>
+      <w:pPr>
+        <w:pBdr>
+          <w:bottom w:val="single" w:sz="6" w:space="1" w:color="BFBFCF"/>
+        </w:pBdr>
+        <w:spacing w:before="120" w:after="120"/>
+      </w:pPr>
+    </w:p>
+    <w:p>
+      <w:pPr>
+        <w:pStyle w:val="Ttulo2"/>
+      </w:pPr>
+      <w:bookmarkStart w:id="19" w:name="_Toc244253444"/>
       <w:r>
         <w:t>1. Herramienta de IA usada</w:t>
       </w:r>
-      <w:bookmarkEnd w:id="18"/>
+      <w:bookmarkEnd w:id="19"/>
     </w:p>
     <w:p>
       <w:pPr>
@@ -16224,11 +17845,11 @@
       <w:pPr>
         <w:pStyle w:val="Ttulo2"/>
       </w:pPr>
-      <w:bookmarkStart w:id="19" w:name="_Toc244249812"/>
+      <w:bookmarkStart w:id="20" w:name="_Toc244253445"/>
       <w:r>
         <w:t>2. Opciones evaluadas</w:t>
       </w:r>
-      <w:bookmarkEnd w:id="19"/>
+      <w:bookmarkEnd w:id="20"/>
     </w:p>
     <w:p>
       <w:pPr>
@@ -17758,11 +19379,11 @@
       <w:pPr>
         <w:pStyle w:val="Ttulo2"/>
       </w:pPr>
-      <w:bookmarkStart w:id="20" w:name="_Toc244249813"/>
+      <w:bookmarkStart w:id="21" w:name="_Toc244253446"/>
       <w:r>
         <w:t>3. ¿Quién puede elegir el estilo?</w:t>
       </w:r>
-      <w:bookmarkEnd w:id="20"/>
+      <w:bookmarkEnd w:id="21"/>
     </w:p>
     <w:p>
       <w:pPr>
@@ -17918,11 +19539,11 @@
       <w:pPr>
         <w:pStyle w:val="Ttulo2"/>
       </w:pPr>
-      <w:bookmarkStart w:id="21" w:name="_Toc244249814"/>
+      <w:bookmarkStart w:id="22" w:name="_Toc244253447"/>
       <w:r>
         <w:t>4. Implementación final (resumen)</w:t>
       </w:r>
-      <w:bookmarkEnd w:id="21"/>
+      <w:bookmarkEnd w:id="22"/>
     </w:p>
     <w:tbl>
       <w:tblPr>
@@ -18401,11 +20022,11 @@
       <w:pPr>
         <w:pStyle w:val="Ttulo2"/>
       </w:pPr>
-      <w:bookmarkStart w:id="22" w:name="_Toc244249815"/>
+      <w:bookmarkStart w:id="23" w:name="_Toc244253448"/>
       <w:r>
         <w:t>5. Pruebas realizadas</w:t>
       </w:r>
-      <w:bookmarkEnd w:id="22"/>
+      <w:bookmarkEnd w:id="23"/>
     </w:p>
     <w:p>
       <w:pPr>
@@ -18555,11 +20176,11 @@
       <w:pPr>
         <w:pStyle w:val="Ttulo2"/>
       </w:pPr>
-      <w:bookmarkStart w:id="23" w:name="_Toc244249816"/>
+      <w:bookmarkStart w:id="24" w:name="_Toc244253449"/>
       <w:r>
         <w:t>6. Fuentes consultadas</w:t>
       </w:r>
-      <w:bookmarkEnd w:id="23"/>
+      <w:bookmarkEnd w:id="24"/>
     </w:p>
     <w:p>
       <w:pPr>
@@ -18668,11 +20289,11 @@
         <w:pStyle w:val="Ttulo1"/>
         <w:pageBreakBefore/>
       </w:pPr>
-      <w:bookmarkStart w:id="24" w:name="_Toc244249817"/>
+      <w:bookmarkStart w:id="25" w:name="_Toc244253450"/>
       <w:r>
         <w:t>Notas RF03 — Gestión de historias</w:t>
       </w:r>
-      <w:bookmarkEnd w:id="24"/>
+      <w:bookmarkEnd w:id="25"/>
     </w:p>
     <w:p>
       <w:pPr>
@@ -18686,11 +20307,11 @@
       <w:pPr>
         <w:pStyle w:val="Ttulo2"/>
       </w:pPr>
-      <w:bookmarkStart w:id="25" w:name="_Toc244249818"/>
+      <w:bookmarkStart w:id="26" w:name="_Toc244253451"/>
       <w:r>
         <w:t>1. Mappers (Capitulo, Opcion, Categoria, Historia)</w:t>
       </w:r>
-      <w:bookmarkEnd w:id="25"/>
+      <w:bookmarkEnd w:id="26"/>
     </w:p>
     <w:p>
       <w:pPr>
@@ -18900,11 +20521,11 @@
       <w:pPr>
         <w:pStyle w:val="Ttulo2"/>
       </w:pPr>
-      <w:bookmarkStart w:id="26" w:name="_Toc244249819"/>
+      <w:bookmarkStart w:id="27" w:name="_Toc244253452"/>
       <w:r>
         <w:t>2. Excepciones propias por entidad</w:t>
       </w:r>
-      <w:bookmarkEnd w:id="26"/>
+      <w:bookmarkEnd w:id="27"/>
     </w:p>
     <w:p>
       <w:pPr>
@@ -19086,7 +20707,7 @@
       <w:pPr>
         <w:pStyle w:val="Ttulo2"/>
       </w:pPr>
-      <w:bookmarkStart w:id="27" w:name="_Toc244249820"/>
+      <w:bookmarkStart w:id="28" w:name="_Toc244253453"/>
       <w:r>
         <w:t>3. Alta de historias (</w:t>
       </w:r>
@@ -19102,7 +20723,7 @@
       <w:r>
         <w:t>)</w:t>
       </w:r>
-      <w:bookmarkEnd w:id="27"/>
+      <w:bookmarkEnd w:id="28"/>
     </w:p>
     <w:p>
       <w:pPr>
@@ -19508,7 +21129,7 @@
       <w:pPr>
         <w:pStyle w:val="Ttulo2"/>
       </w:pPr>
-      <w:bookmarkStart w:id="28" w:name="_Toc244249821"/>
+      <w:bookmarkStart w:id="29" w:name="_Toc244253454"/>
       <w:r>
         <w:t>4. Lectura y edición (</w:t>
       </w:r>
@@ -19548,7 +21169,7 @@
       <w:r>
         <w:t>)</w:t>
       </w:r>
-      <w:bookmarkEnd w:id="28"/>
+      <w:bookmarkEnd w:id="29"/>
     </w:p>
     <w:p>
       <w:pPr>
@@ -19586,11 +21207,11 @@
       <w:pPr>
         <w:pStyle w:val="Ttulo2"/>
       </w:pPr>
-      <w:bookmarkStart w:id="29" w:name="_Toc244249822"/>
+      <w:bookmarkStart w:id="30" w:name="_Toc244253455"/>
       <w:r>
         <w:t>5. Controller y vistas</w:t>
       </w:r>
-      <w:bookmarkEnd w:id="29"/>
+      <w:bookmarkEnd w:id="30"/>
     </w:p>
     <w:p>
       <w:pPr>
@@ -19769,11 +21390,11 @@
       <w:pPr>
         <w:pStyle w:val="Ttulo2"/>
       </w:pPr>
-      <w:bookmarkStart w:id="30" w:name="_Toc244249823"/>
+      <w:bookmarkStart w:id="31" w:name="_Toc244253456"/>
       <w:r>
         <w:t>6. Detalles de UI</w:t>
       </w:r>
-      <w:bookmarkEnd w:id="30"/>
+      <w:bookmarkEnd w:id="31"/>
     </w:p>
     <w:p>
       <w:pPr>
@@ -19843,11 +21464,11 @@
       <w:pPr>
         <w:pStyle w:val="Ttulo2"/>
       </w:pPr>
-      <w:bookmarkStart w:id="31" w:name="_Toc244249824"/>
+      <w:bookmarkStart w:id="32" w:name="_Toc244253457"/>
       <w:r>
         <w:t>7. Datos de prueba</w:t>
       </w:r>
-      <w:bookmarkEnd w:id="31"/>
+      <w:bookmarkEnd w:id="32"/>
     </w:p>
     <w:p>
       <w:pPr>
@@ -19873,11 +21494,11 @@
       <w:pPr>
         <w:pStyle w:val="Ttulo2"/>
       </w:pPr>
-      <w:bookmarkStart w:id="32" w:name="_Toc244249825"/>
+      <w:bookmarkStart w:id="33" w:name="_Toc244253458"/>
       <w:r>
         <w:t>8. Cómo lo probamos</w:t>
       </w:r>
-      <w:bookmarkEnd w:id="32"/>
+      <w:bookmarkEnd w:id="33"/>
     </w:p>
     <w:p>
       <w:pPr>
@@ -19903,11 +21524,11 @@
       <w:pPr>
         <w:pStyle w:val="Ttulo2"/>
       </w:pPr>
-      <w:bookmarkStart w:id="33" w:name="_Toc244249826"/>
+      <w:bookmarkStart w:id="34" w:name="_Toc244253459"/>
       <w:r>
         <w:t>9. Organización en git</w:t>
       </w:r>
-      <w:bookmarkEnd w:id="33"/>
+      <w:bookmarkEnd w:id="34"/>
     </w:p>
     <w:p>
       <w:pPr>
@@ -20006,11 +21627,11 @@
         <w:pStyle w:val="Ttulo1"/>
         <w:pageBreakBefore/>
       </w:pPr>
-      <w:bookmarkStart w:id="34" w:name="_Toc244249827"/>
+      <w:bookmarkStart w:id="35" w:name="_Toc244253460"/>
       <w:r>
         <w:t>Preguntas para el profe</w:t>
       </w:r>
-      <w:bookmarkEnd w:id="34"/>
+      <w:bookmarkEnd w:id="35"/>
     </w:p>
     <w:p>
       <w:pPr>
@@ -20024,7 +21645,7 @@
       <w:pPr>
         <w:pStyle w:val="Ttulo2"/>
       </w:pPr>
-      <w:bookmarkStart w:id="35" w:name="_Toc244249828"/>
+      <w:bookmarkStart w:id="36" w:name="_Toc244253461"/>
       <w:r>
         <w:t xml:space="preserve">1. Serialización JSON de </w:t>
       </w:r>
@@ -20052,7 +21673,7 @@
       <w:r>
         <w:t xml:space="preserve"> (polimorfismo) — Web API de Lectura</w:t>
       </w:r>
-      <w:bookmarkEnd w:id="35"/>
+      <w:bookmarkEnd w:id="36"/>
     </w:p>
     <w:p>
       <w:pPr>
@@ -21054,134 +22675,134 @@
 <file path=word/numbering.xml><?xml version="1.0" encoding="utf-8"?>
 <w:numbering xmlns:wpc="http://schemas.microsoft.com/office/word/2010/wordprocessingCanvas" xmlns:cx="http://schemas.microsoft.com/office/drawing/2014/chartex" xmlns:cx1="http://schemas.microsoft.com/office/drawing/2015/9/8/chartex" xmlns:cx2="http://schemas.microsoft.com/office/drawing/2015/10/21/chartex" xmlns:cx3="http://schemas.microsoft.com/office/drawing/2016/5/9/chartex" xmlns:cx4="http://schemas.microsoft.com/office/drawing/2016/5/10/chartex" xmlns:cx5="http://schemas.microsoft.com/office/drawing/2016/5/11/chartex" xmlns:cx6="http://schemas.microsoft.com/office/drawing/2016/5/12/chartex" xmlns:cx7="http://schemas.microsoft.com/office/drawing/2016/5/13/chartex" xmlns:cx8="http://schemas.microsoft.com/office/drawing/2016/5/14/chartex" xmlns:mc="http://schemas.openxmlformats.org/markup-compatibility/2006" xmlns:aink="http://schemas.microsoft.com/office/drawing/2016/ink" xmlns:am3d="http://schemas.microsoft.com/office/drawing/2017/model3d" xmlns:o="urn:schemas-microsoft-com:office:office" xmlns:oel="http://schemas.microsoft.com/office/2019/extlst" xmlns:r="http://schemas.openxmlformats.org/officeDocument/2006/relationships" xmlns:m="http://schemas.openxmlformats.org/officeDocument/2006/math" xmlns:v="urn:schemas-microsoft-com:vml" xmlns:wp14="http://schemas.microsoft.com/office/word/2010/wordprocessingDrawing" xmlns:wp="http://schemas.openxmlformats.org/drawingml/2006/wordprocessingDrawing" xmlns:w10="urn:schemas-microsoft-com:office:word" xmlns:w="http://schemas.openxmlformats.org/wordprocessingml/2006/main" xmlns:w14="http://schemas.microsoft.com/office/word/2010/wordml" xmlns:w15="http://schemas.microsoft.com/office/word/2012/wordml" xmlns:w16cex="http://schemas.microsoft.com/office/word/2018/wordml/cex" xmlns:w16cid="http://schemas.microsoft.com/office/word/2016/wordml/cid" xmlns:w16="http://schemas.microsoft.com/office/word/2018/wordml" xmlns:w16du="http://schemas.microsoft.com/office/word/2023/wordml/word16du" xmlns:w16sdtdh="http://schemas.microsoft.com/office/word/2020/wordml/sdtdatahash" xmlns:w16sdtfl="http://schemas.microsoft.com/office/word/2024/wordml/sdtformatlock" xmlns:w16se="http://schemas.microsoft.com/office/word/2015/wordml/symex" xmlns:wpg="http://schemas.microsoft.com/office/word/2010/wordprocessingGroup" xmlns:wpi="http://schemas.microsoft.com/office/word/2010/wordprocessingInk" xmlns:wne="http://schemas.microsoft.com/office/word/2006/wordml" xmlns:wps="http://schemas.microsoft.com/office/word/2010/wordprocessingShape" mc:Ignorable="w14 w15 w16se w16cid w16 w16cex w16sdtdh w16sdtfl w16du wp14">
   <w:abstractNum w:abstractNumId="0" w15:restartNumberingAfterBreak="0">
-    <w:nsid w:val="029D6A4A"/>
+    <w:nsid w:val="2B7A22B1"/>
     <w:multiLevelType w:val="hybridMultilevel"/>
-    <w:tmpl w:val="E63E5F40"/>
-    <w:lvl w:ilvl="0" w:tplc="8EC6DCAC">
+    <w:tmpl w:val="4D981E70"/>
+    <w:lvl w:ilvl="0" w:tplc="102CA9AA">
       <w:start w:val="1"/>
-      <w:numFmt w:val="bullet"/>
-      <w:lvlText w:val="•"/>
+      <w:numFmt w:val="decimal"/>
+      <w:lvlText w:val="%1."/>
       <w:lvlJc w:val="left"/>
       <w:pPr>
         <w:ind w:left="720" w:hanging="360"/>
       </w:pPr>
     </w:lvl>
-    <w:lvl w:ilvl="1" w:tplc="4086B036">
+    <w:lvl w:ilvl="1" w:tplc="63844EAE" w:tentative="1">
       <w:start w:val="1"/>
-      <w:numFmt w:val="bullet"/>
-      <w:lvlText w:val="◦"/>
+      <w:numFmt w:val="decimal"/>
+      <w:lvlText w:val="%2."/>
       <w:lvlJc w:val="left"/>
       <w:pPr>
         <w:ind w:left="1080" w:hanging="360"/>
       </w:pPr>
     </w:lvl>
-    <w:lvl w:ilvl="2" w:tplc="9B243840" w:tentative="1">
+    <w:lvl w:ilvl="2" w:tplc="F79805B2" w:tentative="1">
       <w:start w:val="1"/>
-      <w:numFmt w:val="bullet"/>
-      <w:lvlText w:val="▪"/>
+      <w:numFmt w:val="decimal"/>
+      <w:lvlText w:val="%3."/>
       <w:lvlJc w:val="left"/>
       <w:pPr>
         <w:ind w:left="1440" w:hanging="360"/>
       </w:pPr>
     </w:lvl>
-    <w:lvl w:ilvl="3" w:tplc="6128B662">
+    <w:lvl w:ilvl="3" w:tplc="ED4E8A60">
       <w:numFmt w:val="decimal"/>
       <w:lvlText w:val=""/>
       <w:lvlJc w:val="left"/>
     </w:lvl>
-    <w:lvl w:ilvl="4" w:tplc="85E40C1A">
+    <w:lvl w:ilvl="4" w:tplc="F6F47B48">
       <w:numFmt w:val="decimal"/>
       <w:lvlText w:val=""/>
       <w:lvlJc w:val="left"/>
     </w:lvl>
-    <w:lvl w:ilvl="5" w:tplc="9BDCE532">
+    <w:lvl w:ilvl="5" w:tplc="E4F41BA6">
       <w:numFmt w:val="decimal"/>
       <w:lvlText w:val=""/>
       <w:lvlJc w:val="left"/>
     </w:lvl>
-    <w:lvl w:ilvl="6" w:tplc="55E6ADEA">
+    <w:lvl w:ilvl="6" w:tplc="2E12D2E2">
       <w:numFmt w:val="decimal"/>
       <w:lvlText w:val=""/>
       <w:lvlJc w:val="left"/>
     </w:lvl>
-    <w:lvl w:ilvl="7" w:tplc="9BA2FC08">
+    <w:lvl w:ilvl="7" w:tplc="CDD4E6E2">
       <w:numFmt w:val="decimal"/>
       <w:lvlText w:val=""/>
       <w:lvlJc w:val="left"/>
     </w:lvl>
-    <w:lvl w:ilvl="8" w:tplc="8A2ADB88">
+    <w:lvl w:ilvl="8" w:tplc="02DE56AA">
       <w:numFmt w:val="decimal"/>
       <w:lvlText w:val=""/>
       <w:lvlJc w:val="left"/>
     </w:lvl>
   </w:abstractNum>
   <w:abstractNum w:abstractNumId="1" w15:restartNumberingAfterBreak="0">
-    <w:nsid w:val="459B1AFC"/>
+    <w:nsid w:val="55195A8A"/>
     <w:multiLevelType w:val="hybridMultilevel"/>
-    <w:tmpl w:val="C6704640"/>
-    <w:lvl w:ilvl="0" w:tplc="5A7846B0">
+    <w:tmpl w:val="702A7426"/>
+    <w:lvl w:ilvl="0" w:tplc="2FD6A922">
       <w:start w:val="1"/>
-      <w:numFmt w:val="decimal"/>
-      <w:lvlText w:val="%1."/>
+      <w:numFmt w:val="bullet"/>
+      <w:lvlText w:val="•"/>
       <w:lvlJc w:val="left"/>
       <w:pPr>
         <w:ind w:left="720" w:hanging="360"/>
       </w:pPr>
     </w:lvl>
-    <w:lvl w:ilvl="1" w:tplc="5A143B0A" w:tentative="1">
+    <w:lvl w:ilvl="1" w:tplc="1CE01D14">
       <w:start w:val="1"/>
-      <w:numFmt w:val="decimal"/>
-      <w:lvlText w:val="%2."/>
+      <w:numFmt w:val="bullet"/>
+      <w:lvlText w:val="◦"/>
       <w:lvlJc w:val="left"/>
       <w:pPr>
         <w:ind w:left="1080" w:hanging="360"/>
       </w:pPr>
     </w:lvl>
-    <w:lvl w:ilvl="2" w:tplc="48BA6F06" w:tentative="1">
+    <w:lvl w:ilvl="2" w:tplc="CF547700" w:tentative="1">
       <w:start w:val="1"/>
-      <w:numFmt w:val="decimal"/>
-      <w:lvlText w:val="%3."/>
+      <w:numFmt w:val="bullet"/>
+      <w:lvlText w:val="▪"/>
       <w:lvlJc w:val="left"/>
       <w:pPr>
         <w:ind w:left="1440" w:hanging="360"/>
       </w:pPr>
     </w:lvl>
-    <w:lvl w:ilvl="3" w:tplc="A64C4896">
+    <w:lvl w:ilvl="3" w:tplc="A438A3B2">
       <w:numFmt w:val="decimal"/>
       <w:lvlText w:val=""/>
       <w:lvlJc w:val="left"/>
     </w:lvl>
-    <w:lvl w:ilvl="4" w:tplc="06962A42">
+    <w:lvl w:ilvl="4" w:tplc="8626F0F6">
       <w:numFmt w:val="decimal"/>
       <w:lvlText w:val=""/>
       <w:lvlJc w:val="left"/>
     </w:lvl>
-    <w:lvl w:ilvl="5" w:tplc="7706B690">
+    <w:lvl w:ilvl="5" w:tplc="A00466E2">
       <w:numFmt w:val="decimal"/>
       <w:lvlText w:val=""/>
       <w:lvlJc w:val="left"/>
     </w:lvl>
-    <w:lvl w:ilvl="6" w:tplc="20248788">
+    <w:lvl w:ilvl="6" w:tplc="68482314">
       <w:numFmt w:val="decimal"/>
       <w:lvlText w:val=""/>
       <w:lvlJc w:val="left"/>
     </w:lvl>
-    <w:lvl w:ilvl="7" w:tplc="0BA89962">
+    <w:lvl w:ilvl="7" w:tplc="3A5EA442">
       <w:numFmt w:val="decimal"/>
       <w:lvlText w:val=""/>
       <w:lvlJc w:val="left"/>
     </w:lvl>
-    <w:lvl w:ilvl="8" w:tplc="C38090DA">
+    <w:lvl w:ilvl="8" w:tplc="009A7906">
       <w:numFmt w:val="decimal"/>
       <w:lvlText w:val=""/>
       <w:lvlJc w:val="left"/>
     </w:lvl>
   </w:abstractNum>
   <w:abstractNum w:abstractNumId="2" w15:restartNumberingAfterBreak="0">
-    <w:nsid w:val="65BD4501"/>
+    <w:nsid w:val="75894BE2"/>
     <w:multiLevelType w:val="hybridMultilevel"/>
-    <w:tmpl w:val="4E744DA0"/>
-    <w:lvl w:ilvl="0" w:tplc="412456B6" w:tentative="1">
+    <w:tmpl w:val="EB0CE2DC"/>
+    <w:lvl w:ilvl="0" w:tplc="CB7000A0" w:tentative="1">
       <w:start w:val="1"/>
       <w:numFmt w:val="bullet"/>
       <w:lvlText w:val="●"/>
@@ -21190,7 +22811,7 @@
         <w:ind w:left="720" w:hanging="360"/>
       </w:pPr>
     </w:lvl>
-    <w:lvl w:ilvl="1" w:tplc="1C5C7594" w:tentative="1">
+    <w:lvl w:ilvl="1" w:tplc="3B26A1DE" w:tentative="1">
       <w:start w:val="1"/>
       <w:numFmt w:val="bullet"/>
       <w:lvlText w:val="○"/>
@@ -21199,7 +22820,7 @@
         <w:ind w:left="1440" w:hanging="360"/>
       </w:pPr>
     </w:lvl>
-    <w:lvl w:ilvl="2" w:tplc="4DDEC39E" w:tentative="1">
+    <w:lvl w:ilvl="2" w:tplc="4CE8E91A" w:tentative="1">
       <w:start w:val="1"/>
       <w:numFmt w:val="bullet"/>
       <w:lvlText w:val="■"/>
@@ -21208,7 +22829,7 @@
         <w:ind w:left="2160" w:hanging="360"/>
       </w:pPr>
     </w:lvl>
-    <w:lvl w:ilvl="3" w:tplc="327E59EC" w:tentative="1">
+    <w:lvl w:ilvl="3" w:tplc="229882F4" w:tentative="1">
       <w:start w:val="1"/>
       <w:numFmt w:val="bullet"/>
       <w:lvlText w:val="●"/>
@@ -21217,7 +22838,7 @@
         <w:ind w:left="2880" w:hanging="360"/>
       </w:pPr>
     </w:lvl>
-    <w:lvl w:ilvl="4" w:tplc="065C473A" w:tentative="1">
+    <w:lvl w:ilvl="4" w:tplc="4EA8ED02" w:tentative="1">
       <w:start w:val="1"/>
       <w:numFmt w:val="bullet"/>
       <w:lvlText w:val="○"/>
@@ -21226,7 +22847,7 @@
         <w:ind w:left="3600" w:hanging="360"/>
       </w:pPr>
     </w:lvl>
-    <w:lvl w:ilvl="5" w:tplc="08589318" w:tentative="1">
+    <w:lvl w:ilvl="5" w:tplc="F962B2E0" w:tentative="1">
       <w:start w:val="1"/>
       <w:numFmt w:val="bullet"/>
       <w:lvlText w:val="■"/>
@@ -21235,7 +22856,7 @@
         <w:ind w:left="4320" w:hanging="360"/>
       </w:pPr>
     </w:lvl>
-    <w:lvl w:ilvl="6" w:tplc="72EEA632" w:tentative="1">
+    <w:lvl w:ilvl="6" w:tplc="A7FA9598" w:tentative="1">
       <w:start w:val="1"/>
       <w:numFmt w:val="bullet"/>
       <w:lvlText w:val="●"/>
@@ -21244,7 +22865,7 @@
         <w:ind w:left="5040" w:hanging="360"/>
       </w:pPr>
     </w:lvl>
-    <w:lvl w:ilvl="7" w:tplc="540EF59E" w:tentative="1">
+    <w:lvl w:ilvl="7" w:tplc="7902ACD0" w:tentative="1">
       <w:start w:val="1"/>
       <w:numFmt w:val="bullet"/>
       <w:lvlText w:val="●"/>
@@ -21253,7 +22874,7 @@
         <w:ind w:left="5760" w:hanging="360"/>
       </w:pPr>
     </w:lvl>
-    <w:lvl w:ilvl="8" w:tplc="4F6401F6" w:tentative="1">
+    <w:lvl w:ilvl="8" w:tplc="42B8EA66" w:tentative="1">
       <w:start w:val="1"/>
       <w:numFmt w:val="bullet"/>
       <w:lvlText w:val="●"/>
@@ -21263,13 +22884,25 @@
       </w:pPr>
     </w:lvl>
   </w:abstractNum>
-  <w:num w:numId="1" w16cid:durableId="615062416">
+  <w:num w:numId="1" w16cid:durableId="1972400550">
     <w:abstractNumId w:val="2"/>
     <w:lvlOverride w:ilvl="0">
       <w:startOverride w:val="1"/>
     </w:lvlOverride>
   </w:num>
-  <w:num w:numId="2" w16cid:durableId="1564633480">
+  <w:num w:numId="2" w16cid:durableId="1658456096">
+    <w:abstractNumId w:val="0"/>
+    <w:lvlOverride w:ilvl="0">
+      <w:startOverride w:val="1"/>
+    </w:lvlOverride>
+    <w:lvlOverride w:ilvl="1">
+      <w:startOverride w:val="1"/>
+    </w:lvlOverride>
+    <w:lvlOverride w:ilvl="2">
+      <w:startOverride w:val="1"/>
+    </w:lvlOverride>
+  </w:num>
+  <w:num w:numId="3" w16cid:durableId="1891454017">
     <w:abstractNumId w:val="1"/>
     <w:lvlOverride w:ilvl="0">
       <w:startOverride w:val="1"/>
@@ -21281,7 +22914,7 @@
       <w:startOverride w:val="1"/>
     </w:lvlOverride>
   </w:num>
-  <w:num w:numId="3" w16cid:durableId="1440296560">
+  <w:num w:numId="4" w16cid:durableId="2039312882">
     <w:abstractNumId w:val="0"/>
     <w:lvlOverride w:ilvl="0">
       <w:startOverride w:val="1"/>
@@ -21293,8 +22926,8 @@
       <w:startOverride w:val="1"/>
     </w:lvlOverride>
   </w:num>
-  <w:num w:numId="4" w16cid:durableId="69742776">
-    <w:abstractNumId w:val="1"/>
+  <w:num w:numId="5" w16cid:durableId="1555266304">
+    <w:abstractNumId w:val="0"/>
     <w:lvlOverride w:ilvl="0">
       <w:startOverride w:val="1"/>
     </w:lvlOverride>
@@ -21305,8 +22938,8 @@
       <w:startOverride w:val="1"/>
     </w:lvlOverride>
   </w:num>
-  <w:num w:numId="5" w16cid:durableId="244723829">
-    <w:abstractNumId w:val="1"/>
+  <w:num w:numId="6" w16cid:durableId="1959797578">
+    <w:abstractNumId w:val="0"/>
     <w:lvlOverride w:ilvl="0">
       <w:startOverride w:val="1"/>
     </w:lvlOverride>
@@ -21317,8 +22950,8 @@
       <w:startOverride w:val="1"/>
     </w:lvlOverride>
   </w:num>
-  <w:num w:numId="6" w16cid:durableId="1437486448">
-    <w:abstractNumId w:val="1"/>
+  <w:num w:numId="7" w16cid:durableId="498886353">
+    <w:abstractNumId w:val="0"/>
     <w:lvlOverride w:ilvl="0">
       <w:startOverride w:val="1"/>
     </w:lvlOverride>
@@ -21329,8 +22962,8 @@
       <w:startOverride w:val="1"/>
     </w:lvlOverride>
   </w:num>
-  <w:num w:numId="7" w16cid:durableId="478351290">
-    <w:abstractNumId w:val="1"/>
+  <w:num w:numId="8" w16cid:durableId="388847338">
+    <w:abstractNumId w:val="0"/>
     <w:lvlOverride w:ilvl="0">
       <w:startOverride w:val="1"/>
     </w:lvlOverride>
@@ -21341,8 +22974,8 @@
       <w:startOverride w:val="1"/>
     </w:lvlOverride>
   </w:num>
-  <w:num w:numId="8" w16cid:durableId="2057771568">
-    <w:abstractNumId w:val="1"/>
+  <w:num w:numId="9" w16cid:durableId="1941914060">
+    <w:abstractNumId w:val="0"/>
     <w:lvlOverride w:ilvl="0">
       <w:startOverride w:val="1"/>
     </w:lvlOverride>
@@ -21353,8 +22986,8 @@
       <w:startOverride w:val="1"/>
     </w:lvlOverride>
   </w:num>
-  <w:num w:numId="9" w16cid:durableId="693961347">
-    <w:abstractNumId w:val="1"/>
+  <w:num w:numId="10" w16cid:durableId="606818019">
+    <w:abstractNumId w:val="0"/>
     <w:lvlOverride w:ilvl="0">
       <w:startOverride w:val="1"/>
     </w:lvlOverride>
@@ -21365,8 +22998,8 @@
       <w:startOverride w:val="1"/>
     </w:lvlOverride>
   </w:num>
-  <w:num w:numId="10" w16cid:durableId="1932857035">
-    <w:abstractNumId w:val="1"/>
+  <w:num w:numId="11" w16cid:durableId="1191841620">
+    <w:abstractNumId w:val="0"/>
     <w:lvlOverride w:ilvl="0">
       <w:startOverride w:val="1"/>
     </w:lvlOverride>
@@ -21377,8 +23010,8 @@
       <w:startOverride w:val="1"/>
     </w:lvlOverride>
   </w:num>
-  <w:num w:numId="11" w16cid:durableId="1208298029">
-    <w:abstractNumId w:val="1"/>
+  <w:num w:numId="12" w16cid:durableId="280185883">
+    <w:abstractNumId w:val="0"/>
     <w:lvlOverride w:ilvl="0">
       <w:startOverride w:val="1"/>
     </w:lvlOverride>
@@ -21389,20 +23022,8 @@
       <w:startOverride w:val="1"/>
     </w:lvlOverride>
   </w:num>
-  <w:num w:numId="12" w16cid:durableId="537162564">
-    <w:abstractNumId w:val="1"/>
-    <w:lvlOverride w:ilvl="0">
-      <w:startOverride w:val="1"/>
-    </w:lvlOverride>
-    <w:lvlOverride w:ilvl="1">
-      <w:startOverride w:val="1"/>
-    </w:lvlOverride>
-    <w:lvlOverride w:ilvl="2">
-      <w:startOverride w:val="1"/>
-    </w:lvlOverride>
-  </w:num>
-  <w:num w:numId="13" w16cid:durableId="1098600331">
-    <w:abstractNumId w:val="1"/>
+  <w:num w:numId="13" w16cid:durableId="1207910441">
+    <w:abstractNumId w:val="0"/>
     <w:lvlOverride w:ilvl="0">
       <w:startOverride w:val="1"/>
     </w:lvlOverride>

</xml_diff>